<commit_message>
Add new files and updates
</commit_message>
<xml_diff>
--- a/code/Manuscript_Bilingualism Effect for Delaying Dementia Onset_A Bayesian Meta-Analysis.docx
+++ b/code/Manuscript_Bilingualism Effect for Delaying Dementia Onset_A Bayesian Meta-Analysis.docx
@@ -31,22 +31,7 @@
         <w:pStyle w:val="Date"/>
       </w:pPr>
       <w:r>
-        <w:t>202</w:t>
-      </w:r>
-      <w:r>
-        <w:t>5</w:t>
-      </w:r>
-      <w:r>
-        <w:t>-0</w:t>
-      </w:r>
-      <w:r>
-        <w:t>5</w:t>
-      </w:r>
-      <w:r>
-        <w:t>-</w:t>
-      </w:r>
-      <w:r>
-        <w:t>14</w:t>
+        <w:t>2025-05-14</w:t>
       </w:r>
     </w:p>
     <w:p>
@@ -69,6 +54,7 @@
     <w:p>
       <w:pPr>
         <w:pStyle w:val="Heading1"/>
+        <w:jc w:val="both"/>
       </w:pPr>
       <w:bookmarkStart w:id="0" w:name="introduction"/>
       <w:r>
@@ -96,6 +82,12 @@
     </w:p>
     <w:p>
       <w:pPr>
+        <w:pStyle w:val="BodyText"/>
+        <w:jc w:val="both"/>
+      </w:pPr>
+    </w:p>
+    <w:p>
+      <w:pPr>
         <w:pStyle w:val="Heading1"/>
         <w:jc w:val="both"/>
       </w:pPr>
@@ -121,17 +113,12 @@
         <w:jc w:val="both"/>
       </w:pPr>
       <w:r>
-        <w:t xml:space="preserve">Reserve in a broader sense refers to the individual variations in cognitive ability, clinical condition, and functional capacity in ageing and brain disease, which indicates that specific conditions of brain health can lead to different cognitive or functional outcomes in different individuals (Berkes &amp; Bialystok, 2022). Stern et al. (2020) stated that there are different types of reserve, namely brain reserve and cognitive reserve. The former refers to the neurobiological quality such as cortical thickness, quantity of neurons, and total brain volume at a given point in time (Stern et al., 2020). Individuals with high brain reserve are supposed to better withstand ageing and neurological decline since they have more tissue to lose. Such a passive model of reserve is impacted by genetic and lifestyle factors, and it does not invoke active cognitive adaptation (Stern et al., 2020). In contrast, cognitive reserve is thought of as an active reserve form which depends on individuals’ adaptability to cognitive processes (Berkes &amp; Bialystok, 2022). As mentioned before, Individuals can adopt remedial mechanisms to better cope with ageing and brain loss (Berkes &amp; Bialystok, 2022). In this sense, there should be several outcomes when comparing high-cognitive </w:t>
+        <w:t xml:space="preserve">Reserve in a broader sense refers to the individual variations in cognitive ability, clinical condition, and functional capacity in ageing and brain disease, which indicates that specific conditions of brain health can lead to different cognitive or functional outcomes in different individuals (Berkes &amp; Bialystok, 2022). Stern et al. (2020) stated that there are different types of reserve, namely brain reserve and cognitive reserve. The former refers to the neurobiological quality such as cortical thickness, quantity of neurons, and total brain volume at a given point in time (Stern et al., 2020). Individuals with high brain reserve are supposed to better withstand ageing and neurological decline since they have more tissue to lose. Such a passive model of reserve is impacted by genetic and lifestyle factors, and it does not invoke active cognitive adaptation (Stern et al., 2020). In contrast, cognitive reserve is thought of as an active reserve form which depends on individuals’ adaptability to cognitive processes (Berkes &amp; Bialystok, 2022). As mentioned before, Individuals can adopt remedial mechanisms to better cope with ageing and brain loss (Berkes &amp; Bialystok, </w:t>
       </w:r>
       <w:r>
         <w:lastRenderedPageBreak/>
-        <w:t>reserve and low-cognitive reserve ageing adults. At similar levels of neuropathology, high cognitive reserve individuals should show better cognitive performance than their low cognitive reserve peers. For individuals with similar cognitive performance, high-cognitive reserve individuals are expected to have more neuropathology than low-cognitive reserve individuals. Moreover, high-cognitive reserve individuals are expected to show delayed symptom onset compared with matched low-cognitive reserve individuals.</w:t>
-      </w:r>
-    </w:p>
-    <w:p>
-      <w:pPr>
-        <w:pStyle w:val="BodyText"/>
-      </w:pPr>
+        <w:t>2022). In this sense, there should be several outcomes when comparing high-cognitive reserve and low-cognitive reserve ageing adults. At similar levels of neuropathology, high cognitive reserve individuals should show better cognitive performance than their low cognitive reserve peers. For individuals with similar cognitive performance, high-cognitive reserve individuals are expected to have more neuropathology than low-cognitive reserve individuals. Moreover, high-cognitive reserve individuals are expected to show delayed symptom onset compared with matched low-cognitive reserve individuals.</w:t>
+      </w:r>
     </w:p>
     <w:p>
       <w:pPr>
@@ -171,26 +158,15 @@
     <w:p>
       <w:pPr>
         <w:pStyle w:val="BodyText"/>
-      </w:pPr>
-    </w:p>
-    <w:p>
-      <w:pPr>
-        <w:pStyle w:val="BodyText"/>
-        <w:jc w:val="both"/>
-      </w:pPr>
-      <w:r>
-        <w:t xml:space="preserve">From the perspective of neuroscience, one explanation for bilinguals’ enhanced executive function may be that multiple language use reallocates the cognitive demand from anterior regions to posterior lobes and subcortical regions including the basal ganglia (Grundy &amp; Anderson, 2017). The anterior lobes are typically believed for complex EF tasks while posterior and subcortical regions are largely believed for automatic processing. Several neuroimaging studies have provided evidence for such a shift to improve neural efficiency in the bilingual brain. For instance, Abutalebi et al. (2015) used fMRI to record bilingual and </w:t>
+        <w:jc w:val="both"/>
+      </w:pPr>
+      <w:r>
+        <w:t xml:space="preserve">From the perspective of neuroscience, one explanation for bilinguals’ enhanced executive function may be that multiple language use reallocates the cognitive demand from anterior regions to posterior lobes and subcortical regions including the basal ganglia (Grundy &amp; Anderson, 2017). The anterior lobes are typically believed for complex EF tasks while posterior and subcortical regions are largely believed for automatic processing. Several neuroimaging studies have provided evidence for such a shift to improve neural efficiency in the bilingual brain. For instance, Abutalebi et al. (2015) used fMRI to record bilingual and monolingual brain signals when they performed flanker tasks. The results show that bilinguals showed better behavioural performance and that they recruited less anterior </w:t>
       </w:r>
       <w:r>
         <w:lastRenderedPageBreak/>
-        <w:t>monolingual brain signals when they performed flanker tasks. The results show that bilinguals showed better behavioural performance and that they recruited less anterior cingulate cortex (ACC) than monolinguals (Abutalebi et al., 2015). In Waldie et al. (2009), the fMRI results showed that Macedonian-English bilinguals possessed more activation in the basal ganglia area compared with monolinguals when they performed a Stroop task. Since the basal ganglia is a subcortical area that functions as a gate for anterior cortical regions, Waldie et al. (2009) also provide evidence for bilinguals’ reallocation of cognitive resources.</w:t>
-      </w:r>
-    </w:p>
-    <w:p>
-      <w:pPr>
-        <w:pStyle w:val="BodyText"/>
-        <w:jc w:val="both"/>
-      </w:pPr>
+        <w:t>cingulate cortex (ACC) than monolinguals (Abutalebi et al., 2015). In Waldie et al. (2009), the fMRI results showed that Macedonian-English bilinguals possessed more activation in the basal ganglia area compared with monolinguals when they performed a Stroop task. Since the basal ganglia is a subcortical area that functions as a gate for anterior cortical regions, Waldie et al. (2009) also provide evidence for bilinguals’ reallocation of cognitive resources.</w:t>
+      </w:r>
     </w:p>
     <w:p>
       <w:pPr>
@@ -230,7 +206,11 @@
     <w:p>
       <w:pPr>
         <w:pStyle w:val="BodyText"/>
-      </w:pPr>
+        <w:jc w:val="both"/>
+      </w:pPr>
+      <w:r>
+        <w:t>As mentioned before, one important prediction from cognitive reserve is that individuals with high reserve will show a delayed onset of impairment than individuals with low reserve (Berkes &amp; Bialystok, 2022). Retrospective studies compared the age of onset or diagnosis of dementia for both bilinguals and monolinguals in clinical samples. Bialystok et al. (2007) were the first to examine such effects on clinical populations with dementia. By examining the records of 184 patients with equivalent progression of Mini-Mnetal State Examination [MMSE; Folstein et al. (1975)] scores in Toronto Canada, they found that bilingual patients developed symptoms of dementia later than their monolingual peers for around 4 years (F (1, 178) = 9.16, p&lt;0.003). The results have been replicated in different populations in various countries such as China (Zheng et al., 2018), India (Alladi et al., 2013), and Belgium (E. V. Y. Woumans et al., 2015). Given the mostly positive results of previous retrospective studies and the moderate effect (Cohen’s d = 0.32) of previous meta-analysis (Anderson et al., 2020), it seems that bilingualism’s delaying effect is less inconclusive than incidence rate studies.</w:t>
+      </w:r>
     </w:p>
     <w:p>
       <w:pPr>
@@ -238,7 +218,11 @@
         <w:jc w:val="both"/>
       </w:pPr>
       <w:r>
-        <w:t>As mentioned before, one important prediction from cognitive reserve is that individuals with high reserve will show a delayed onset of impairment than individuals with low reserve (Berkes &amp; Bialystok, 2022). Retrospective studies compared the age of onset or diagnosis of dementia for both bilinguals and monolinguals in clinical samples. Bialystok et al. (2007) were the first to examine such effects on clinical populations with dementia. By examining the records of 184 patients with equivalent progression of Mini-Mnetal State Examination [MMSE; Folstein et al. (1975)] scores in Toronto Canada, they found that bilingual patients developed symptoms of dementia later than their monolingual peers for around 4 years (F (1, 178) = 9.16, p&lt;0.003). The results have been replicated in different populations in various countries such as China (Zheng et al., 2018), India (Alladi et al., 2013), and Belgium (E. V. Y. Woumans et al., 2015). Given the mostly positive results of previous retrospective studies and the moderate effect (Cohen’s d = 0.32) of previous meta-analysis (Anderson et al., 2020), it seems that bilingualism’s delaying effect is less inconclusive than incidence rate studies.</w:t>
+        <w:t xml:space="preserve">Compared to retrospective studies, most prospective studies have a different outcome variable, the dementia incidence rate in certain populations (Grundy &amp; Anderson, 2017). These studies track groups of healthy individuals and collect the rates of dementia in the groups during the study period. Yet, these prospective studies tend to find non-significant results of bilingualism’s preventive effects. For instance, (Zahodne et al., 2014) followed a </w:t>
+      </w:r>
+      <w:r>
+        <w:lastRenderedPageBreak/>
+        <w:t>sample of 1067 old Spanish-English bilinguals and Spanish monolinguals in New York while collecting their cognitive test scores and clinical diagnoses every 18 to 24 months for approximately 20 years. At the end of the study, 31% of monolinguals and 20% of bilinguals had been diagnosed dementia (Zahodne et al., 2014). The results showed that bilingualism was associated with 0.291 lower log odds of incidence rates. After accounting for other predictors, bilingualism was not correlated with dementia risk despite attending higher education and being female being associated with lower dementia risk (Zahodne et al., 2014). Similarly, Lawton et al. (2015) and Ljungberg et al. (2016) also found no single correlation between reduced dementia risk and bilingualism in the US (x2(1, n=81) = .13, p = .72) and Sweden (bilinguals: Hazard Ratio = 1.43, 95% CI = 0.73 − 2.85, p = .29) respectively. Moreover, Mukadam et al. (2017) conducted a meta-analysis using only four prospective studies and found that bilingualism was not related to the protective effect of cognitive decline or dementia (Odds Ratio of dementia rates in bilinguals compared with monolinguals: 0.96 with a 95% CI [0.74 – 1.23]). They further argued that public health policy should not recommend bilingualism as “a strategy to delay dementia” (Mukadam et al., 2017, p. 53). Yet the present study will argue that their argument is premature and that the difference of bilingualism’s delaying effect and preventive effect should be drawn.</w:t>
       </w:r>
     </w:p>
     <w:p>
@@ -246,6 +230,9 @@
         <w:pStyle w:val="BodyText"/>
         <w:jc w:val="both"/>
       </w:pPr>
+      <w:r>
+        <w:t>Since the publication of their meta-analysis (Mukadam et al., 2017), several scholars have criticised their conceptual and methodological approach (Grundy &amp; Anderson, 2017; E. Woumans et al., 2017). For the conceptual issue, most prospective studies examined the dementia incidence rate, which is different from the age at onset of dementia, the outcome variable of retrospective studies. The interpretation of the null summary effect of the four prospective studies should not be conflated with bilingualism’s effect on the age of dementia onset. Thus, Mukadam et al. (2017) results can only partially show that there is no robust evidence that bilingualism can reduce the incidence rates of dementia. For the methodological issues, their meta-analysis neglected two additional studies that showed a bilingual advantage in their study. Additionally, one recent community study conducted by Venugopal et al. (2024) also committed a bilingual effect on lower dementia risks among non-immigrant populations in India. Given these limitations of previous meta-analysis, the present meta-analysis will reexamine the bilingualism’s effect on age at onset of dementia and incidence rates respectively.</w:t>
+      </w:r>
     </w:p>
     <w:p>
       <w:pPr>
@@ -253,48 +240,8 @@
         <w:jc w:val="both"/>
       </w:pPr>
       <w:r>
-        <w:t>Compared to retrospective studies, most prospective studies have a different outcome variable, the dementia incidence rate in certain populations (Grundy &amp; Anderson, 2017). These studies track groups of healthy individuals and collect the rates of dementia in the groups during the study period. Yet, these prospective studies tend to find non-significant results of bilingualism’s preventive effects. For instance, (Zahodne et al., 2014) followed a sample of 1067 old Spanish-English bilinguals and Spanish monolinguals in New York while collecting their cognitive test scores and clinical diagnoses every 18 to 24 months for approximately 20 years. At the end of the study, 31% of monolinguals and 20% of bilinguals had been diagnosed dementia (Zahodne et al., 2014). The results showed that bilingualism was associated with 0.291 lower log odds of incidence rates. After accounting for other predictors, bilingualism was not correlated with dementia risk despite attending higher education and being female being associated with lower dementia risk (Zahodne et al., 2014). Similarly, Lawton et al. (2015) and Ljungberg et al. (2016) also found no single correlation between reduced dementia risk and bilingualism in the US (x2(1, n=81) = .13, p = .72) and Sweden (bilinguals: Hazard Ratio = 1.43, 95% CI = 0.73 − 2.85, p = .29) respectively. Moreover, Mukadam et al. (2017) conducted a meta-analysis using only four prospective studies and found that bilingualism was not related to the protective effect of cognitive decline or dementia (Odds Ratio of dementia rates in bilinguals compared with monolinguals: 0.96 with a 95% CI [0.74 – 1.23]). They further argued that public health policy should not recommend bilingualism as “a strategy to delay dementia” (Mukadam et al., 2017, p. 53). Yet the present study will argue that their argument is premature and that the difference of bilingualism’s delaying effect and preventive effect should be drawn.</w:t>
-      </w:r>
-    </w:p>
-    <w:p>
-      <w:pPr>
-        <w:pStyle w:val="BodyText"/>
-        <w:jc w:val="both"/>
-      </w:pPr>
-    </w:p>
-    <w:p>
-      <w:pPr>
-        <w:pStyle w:val="BodyText"/>
-        <w:jc w:val="both"/>
-      </w:pPr>
-      <w:r>
-        <w:t>Since the publication of their meta-analysis (Mukadam et al., 2017), several scholars have criticised their conceptual and methodological approach (Grundy &amp; Anderson, 2017; E. Woumans et al., 2017). For the conceptual issue, most prospective studies examined the dementia incidence rate, which is different from the age at onset of dementia, the outcome variable of retrospective studies. The interpretation of the null summary effect of the four prospective studies should not be conflated with bilingualism’s effect on the age of dementia onset. Thus, Mukadam et al. (2017) results can only partially show that there is no robust evidence that bilingualism can reduce the incidence rates of dementia. For the methodological issues, their meta-analysis neglected two additional studies that showed a bilingual advantage in their study. Additionally, one recent community study conducted by Venugopal et al. (2024) also committed a bilingual effect on lower dementia risks among non-immigrant populations in India. Given these limitations of previous meta-analysis, the present meta-analysis will reexamine the bilingualism’s effect on age at onset of dementia and incidence rates respectively.</w:t>
-      </w:r>
-    </w:p>
-    <w:p>
-      <w:pPr>
-        <w:pStyle w:val="BodyText"/>
-        <w:jc w:val="both"/>
-      </w:pPr>
-    </w:p>
-    <w:p>
-      <w:pPr>
-        <w:pStyle w:val="BodyText"/>
-        <w:jc w:val="both"/>
-      </w:pPr>
-      <w:r>
-        <w:t xml:space="preserve">Additionally, there may be some limits considering the effect of bilingualism on dementia. There is no reason to expect bilingualism as a factor of cognitive reserve to prevent </w:t>
-      </w:r>
-      <w:r>
-        <w:lastRenderedPageBreak/>
-        <w:t>dementia’s neuropathology since cognitive reserve helps the old to better withstand the impact of neuropathology but not to avoid it from happening. If bilingualism indeed has a preventive effect against dementia, other mechanisms are supposed to be found to explain such an effect. Given these inadequacies of previous meta-analysis and the potential limits of the bilingualism effect, the present meta-analyses will reexamine the bilingualism’s effect on age at onset of dementia and incidence rates respectively.</w:t>
-      </w:r>
-    </w:p>
-    <w:p>
-      <w:pPr>
-        <w:pStyle w:val="BodyText"/>
-        <w:jc w:val="both"/>
-      </w:pPr>
+        <w:t>Additionally, there may be some limits considering the effect of bilingualism on dementia. There is no reason to expect bilingualism as a factor of cognitive reserve to prevent dementia’s neuropathology since cognitive reserve helps the old to better withstand the impact of neuropathology but not to avoid it from happening. If bilingualism indeed has a preventive effect against dementia, other mechanisms are supposed to be found to explain such an effect. Given these inadequacies of previous meta-analysis and the potential limits of the bilingualism effect, the present meta-analyses will reexamine the bilingualism’s effect on age at onset of dementia and incidence rates respectively.</w:t>
+      </w:r>
     </w:p>
     <w:p>
       <w:pPr>
@@ -304,6 +251,7 @@
       <w:bookmarkStart w:id="5" w:name="research-questions"/>
       <w:bookmarkEnd w:id="4"/>
       <w:r>
+        <w:lastRenderedPageBreak/>
         <w:t>Research Questions</w:t>
       </w:r>
     </w:p>
@@ -384,19 +332,7 @@
         <w:jc w:val="both"/>
       </w:pPr>
       <w:r>
-        <w:t xml:space="preserve">For a study to be included, it must meet the following criteria: (a). The study must include the bilingual and monolingual samples. (b). The study should be about dementia or mild </w:t>
-      </w:r>
-      <w:r>
-        <w:lastRenderedPageBreak/>
-        <w:t xml:space="preserve">cognitive impairment (MCI). (c). The articles included need to provide necessary information of both bilingual and monolingual groups (i.e., for age at onset study: sample size, the mean age of onset and standard deviation of each group; for incidence rate study: sample size, the number of individuals who developed dementia during the study period). Additionally, they </w:t>
-      </w:r>
-      <w:proofErr w:type="gramStart"/>
-      <w:r>
-        <w:t>have to</w:t>
-      </w:r>
-      <w:proofErr w:type="gramEnd"/>
-      <w:r>
-        <w:t xml:space="preserve"> report mean years of education and standard deviation for both bilingual and monolingual groups.</w:t>
+        <w:t>For a study to be included, it must meet the following criteria: (a). The study must include the bilingual and monolingual samples. (b). The study should be about dementia or mild cognitive impairment (MCI). (c). The articles included need to provide necessary information of both bilingual and monolingual groups (i.e., for age at onset study: sample size, the mean age of onset and standard deviation of each group; for incidence rate study: sample size, the number of individuals who developed dementia during the study period). Additionally, they have to report mean years of education and standard deviation for both bilingual and monolingual groups.</w:t>
       </w:r>
     </w:p>
     <w:p>
@@ -412,6 +348,7 @@
       <w:bookmarkStart w:id="9" w:name="data-coding"/>
       <w:bookmarkEnd w:id="8"/>
       <w:r>
+        <w:lastRenderedPageBreak/>
         <w:t>Data Coding</w:t>
       </w:r>
     </w:p>
@@ -481,11 +418,11 @@
         <w:jc w:val="both"/>
       </w:pPr>
       <w:r>
-        <w:t xml:space="preserve">Apart from generating summary effects for included studies, it is necessary to check the effect of other confounding variables especially when there is an inconsistent relation </w:t>
+        <w:t xml:space="preserve">Apart from generating summary effects for included studies, it is necessary to check the effect of other confounding variables especially when there is an inconsistent relation between an independent variable and an outcome across studies (Frazier et al., 2004). The confounding variable is different from the modulating variable because their relations to the independent variable, outcome variable and the effect are different. A confounding variable has its influence on both the outcome (in this meta-analysis: age at onset or incidence rates) and the independent variable (bilingualism). A modulating factor influences or changes the interactions between variables. Following the previous meta-analysis (Anderson et al., 2020), the present study will also conduct an extra regression model to include the confounding variable years of education (YoE). Additionally, it will </w:t>
       </w:r>
       <w:r>
         <w:lastRenderedPageBreak/>
-        <w:t>between an independent variable and an outcome across studies (Frazier et al., 2004). The confounding variable is different from the modulating variable because their relations to the independent variable, outcome variable and the effect are different. A confounding variable has its influence on both the outcome (in this meta-analysis: age at onset or incidence rates) and the independent variable (bilingualism). A modulating factor influences or changes the interactions between variables. Following the previous meta-analysis (Anderson et al., 2020), the present study will also conduct an extra regression model to include the confounding variable years of education (YoE). Additionally, it will also conduct a subgroup analysis to compare the effect of types of dementia since the dementia type is a categorical variable that influences the potential bilingualism effect on delaying age at dementia onset. The following section will explain the reason to treat YoE as the confounding and the type of dementia as the modulating variable respectively.</w:t>
+        <w:t>also conduct a subgroup analysis to compare the effect of types of dementia since the dementia type is a categorical variable that influences the potential bilingualism effect on delaying age at dementia onset. The following section will explain the reason to treat YoE as the confounding and the type of dementia as the modulating variable respectively.</w:t>
       </w:r>
     </w:p>
     <w:p>
@@ -550,7 +487,7 @@
               </w:rPr>
               <w:lastRenderedPageBreak/>
               <w:drawing>
-                <wp:inline distT="0" distB="0" distL="0" distR="0" wp14:anchorId="1BBEB036" wp14:editId="7D7AC129">
+                <wp:inline distT="0" distB="0" distL="0" distR="0" wp14:anchorId="043CCA5D" wp14:editId="2B2C05A3">
                   <wp:extent cx="5334000" cy="3643222"/>
                   <wp:effectExtent l="0" t="0" r="0" b="0"/>
                   <wp:docPr id="31" name="Picture"/>
@@ -647,6 +584,11 @@
     </w:p>
     <w:p>
       <w:pPr>
+        <w:pStyle w:val="BodyText"/>
+      </w:pPr>
+    </w:p>
+    <w:p>
+      <w:pPr>
         <w:pStyle w:val="Heading1"/>
         <w:jc w:val="both"/>
       </w:pPr>
@@ -715,7 +657,7 @@
               </w:rPr>
               <w:lastRenderedPageBreak/>
               <w:drawing>
-                <wp:inline distT="0" distB="0" distL="0" distR="0" wp14:anchorId="69512EEA" wp14:editId="6A81ABEF">
+                <wp:inline distT="0" distB="0" distL="0" distR="0" wp14:anchorId="52E10C5D" wp14:editId="1EA436EF">
                   <wp:extent cx="5334000" cy="5432777"/>
                   <wp:effectExtent l="0" t="0" r="0" b="0"/>
                   <wp:docPr id="39" name="Picture"/>
@@ -808,10 +750,11 @@
     </w:p>
     <w:p>
       <w:pPr>
-        <w:pStyle w:val="Heading3"/>
+        <w:pStyle w:val="Heading2"/>
         <w:jc w:val="both"/>
       </w:pPr>
       <w:bookmarkStart w:id="19" w:name="Xd0df9da9ee21d5417233a08b5c4c4fb8729a75c"/>
+      <w:bookmarkEnd w:id="18"/>
       <w:r>
         <w:t>Results for Meta-analysis of Bilingualism and Age at Onset of Dementia</w:t>
       </w:r>
@@ -863,40 +806,40 @@
               </w:rPr>
               <w:lastRenderedPageBreak/>
               <w:drawing>
-                <wp:inline distT="0" distB="0" distL="0" distR="0" wp14:anchorId="0BADE35E" wp14:editId="28F84413">
-                  <wp:extent cx="5334000" cy="4267200"/>
+                <wp:inline distT="0" distB="0" distL="0" distR="0" wp14:anchorId="45EEB974" wp14:editId="0AA58FEB">
+                  <wp:extent cx="5943600" cy="3665220"/>
                   <wp:effectExtent l="0" t="0" r="0" b="0"/>
-                  <wp:docPr id="44" name="Picture"/>
-                  <wp:cNvGraphicFramePr/>
+                  <wp:docPr id="1331179537" name="Picture 1" descr="A graph with numbers and lines&#10;&#10;AI-generated content may be incorrect."/>
+                  <wp:cNvGraphicFramePr>
+                    <a:graphicFrameLocks xmlns:a="http://schemas.openxmlformats.org/drawingml/2006/main" noChangeAspect="1"/>
+                  </wp:cNvGraphicFramePr>
                   <a:graphic xmlns:a="http://schemas.openxmlformats.org/drawingml/2006/main">
                     <a:graphicData uri="http://schemas.openxmlformats.org/drawingml/2006/picture">
                       <pic:pic xmlns:pic="http://schemas.openxmlformats.org/drawingml/2006/picture">
                         <pic:nvPicPr>
-                          <pic:cNvPr id="45" name="Picture" descr="Bilingualism-and-Dementia_Meta-analysis_files/figure-docx/fig-fig3-1.png"/>
-                          <pic:cNvPicPr>
-                            <a:picLocks noChangeAspect="1" noChangeArrowheads="1"/>
-                          </pic:cNvPicPr>
+                          <pic:cNvPr id="1331179537" name="Picture 1" descr="A graph with numbers and lines&#10;&#10;AI-generated content may be incorrect."/>
+                          <pic:cNvPicPr/>
                         </pic:nvPicPr>
                         <pic:blipFill>
-                          <a:blip r:embed="rId7"/>
+                          <a:blip r:embed="rId7" cstate="print">
+                            <a:extLst>
+                              <a:ext uri="{28A0092B-C50C-407E-A947-70E740481C1C}">
+                                <a14:useLocalDpi xmlns:a14="http://schemas.microsoft.com/office/drawing/2010/main" val="0"/>
+                              </a:ext>
+                            </a:extLst>
+                          </a:blip>
                           <a:stretch>
                             <a:fillRect/>
                           </a:stretch>
                         </pic:blipFill>
-                        <pic:spPr bwMode="auto">
+                        <pic:spPr>
                           <a:xfrm>
                             <a:off x="0" y="0"/>
-                            <a:ext cx="5334000" cy="4267200"/>
+                            <a:ext cx="5943600" cy="3665220"/>
                           </a:xfrm>
                           <a:prstGeom prst="rect">
                             <a:avLst/>
                           </a:prstGeom>
-                          <a:noFill/>
-                          <a:ln w="9525">
-                            <a:noFill/>
-                            <a:headEnd/>
-                            <a:tailEnd/>
-                          </a:ln>
                         </pic:spPr>
                       </pic:pic>
                     </a:graphicData>
@@ -915,6 +858,13 @@
               <w:t>Figure 3: Forest plot of Bilingualism and Age at Onset of Dementia (Note: The estimates and 95% CrI are the differences between bilinguals and monolinguals, so a positive number indicates later onsets for bilinguals.)</w:t>
             </w:r>
           </w:p>
+          <w:p>
+            <w:pPr>
+              <w:pStyle w:val="ImageCaption"/>
+              <w:spacing w:before="200"/>
+              <w:jc w:val="both"/>
+            </w:pPr>
+          </w:p>
         </w:tc>
         <w:bookmarkEnd w:id="20"/>
       </w:tr>
@@ -925,7 +875,6 @@
         <w:jc w:val="both"/>
       </w:pPr>
       <w:bookmarkStart w:id="21" w:name="heterogeneity-across-studies"/>
-      <w:bookmarkEnd w:id="19"/>
       <w:r>
         <w:t>Heterogeneity across Studies</w:t>
       </w:r>
@@ -966,7 +915,7 @@
               </w:rPr>
               <w:lastRenderedPageBreak/>
               <w:drawing>
-                <wp:inline distT="0" distB="0" distL="0" distR="0" wp14:anchorId="575845D9" wp14:editId="707C7177">
+                <wp:inline distT="0" distB="0" distL="0" distR="0" wp14:anchorId="29835691" wp14:editId="2E9CBC90">
                   <wp:extent cx="5334000" cy="3429000"/>
                   <wp:effectExtent l="0" t="0" r="0" b="0"/>
                   <wp:docPr id="49" name="Picture"/>
@@ -1058,18 +1007,38 @@
         <w:pStyle w:val="BodyText"/>
         <w:jc w:val="both"/>
       </w:pPr>
+      <w:r>
+        <w:t xml:space="preserve">A careful investigation into the contexts of each study provided some potential evidence for such heterogeneity. One prominent difference between the first and second groups of studies might be the type of dementia. Among the 6 studies in the second group, three of them involved the FTD variant of dementia, one of them involved MCI patients and the </w:t>
+      </w:r>
+      <w:r>
+        <w:lastRenderedPageBreak/>
+        <w:t>other two involved AD patients. In contrast, seven out of eight studies in the first group and all of the four studies in the third group involved AD patients despite one study having MCI patients. Such differences in the distribution of types of dementia among different groups of studies further called for subgroup analysis of different types of dementia and to investigate whether the type of dementia influences the differences in age at onset of dementia in bilinguals and monolinguals (see 4.3.3).</w:t>
+      </w:r>
     </w:p>
     <w:p>
       <w:pPr>
         <w:pStyle w:val="BodyText"/>
         <w:jc w:val="both"/>
       </w:pPr>
-      <w:r>
-        <w:t xml:space="preserve">A careful investigation into the contexts of each study provided some potential evidence for such heterogeneity. One prominent difference between the first and second groups of </w:t>
-      </w:r>
-      <w:r>
-        <w:lastRenderedPageBreak/>
-        <w:t>studies might be the type of dementia. Among the 6 studies in the second group, three of them involved the FTD variant of dementia, one of them involved MCI patients and the other two involved AD patients. In contrast, seven out of eight studies in the first group and all of the four studies in the third group involved AD patients despite one study having MCI patients. Such differences in the distribution of types of dementia among different groups of studies further called for subgroup analysis of different types of dementia and to investigate whether the type of dementia influences the differences in age at onset of dementia in bilinguals and monolinguals (see 4.3.3).</w:t>
+    </w:p>
+    <w:p>
+      <w:pPr>
+        <w:pStyle w:val="Heading3"/>
+        <w:jc w:val="both"/>
+      </w:pPr>
+      <w:bookmarkStart w:id="23" w:name="the-role-of-education-is-uncertain"/>
+      <w:bookmarkEnd w:id="21"/>
+      <w:r>
+        <w:t>The Role of Education is Uncertain</w:t>
+      </w:r>
+    </w:p>
+    <w:p>
+      <w:pPr>
+        <w:pStyle w:val="FirstParagraph"/>
+        <w:jc w:val="both"/>
+      </w:pPr>
+      <w:r>
+        <w:t>To examine whether years of education had an influence on the meta-analytic effect, I included years of education into the right side of previous Bayesian linear model. The results showed that the population-level effect of “years of education” on the age at onset of dementia was between -0.63 and 0.36 at 95% Crl (β = -0.11, Est.Error = 0.26). It was quite uncertain about the role of Education since the effect involves both negative and positive values. This indicates that we are still uncertain whether “years of education” has an effect on age at onset of dementia (either positive or negative) or not, based on the data in the meta-analysis.</w:t>
       </w:r>
     </w:p>
     <w:p>
@@ -1077,61 +1046,23 @@
         <w:pStyle w:val="BodyText"/>
         <w:jc w:val="both"/>
       </w:pPr>
-    </w:p>
-    <w:p>
-      <w:pPr>
-        <w:pStyle w:val="Heading2"/>
-        <w:jc w:val="both"/>
-      </w:pPr>
-      <w:bookmarkStart w:id="23" w:name="the-role-of-education-is-uncertain"/>
-      <w:bookmarkEnd w:id="18"/>
-      <w:bookmarkEnd w:id="21"/>
-      <w:r>
-        <w:t>The Role of Education is Uncertain</w:t>
-      </w:r>
-    </w:p>
-    <w:p>
-      <w:pPr>
-        <w:pStyle w:val="FirstParagraph"/>
-        <w:jc w:val="both"/>
-      </w:pPr>
-      <w:r>
-        <w:t xml:space="preserve">To examine whether years of education had an influence on the meta-analytic effect, I included years of education into the right side of previous Bayesian linear model. The results showed that the population-level effect of “years of education” on the age at onset of dementia was between -0.63 and 0.36 at 95% Crl (β = -0.11, Est.Error = 0.26). It was quite uncertain about the role of Education since the effect involves both negative and positive values. This indicates that we are still uncertain whether “years of education” </w:t>
-      </w:r>
-      <w:proofErr w:type="gramStart"/>
-      <w:r>
-        <w:t>has an effect on</w:t>
-      </w:r>
-      <w:proofErr w:type="gramEnd"/>
-      <w:r>
-        <w:t xml:space="preserve"> age at onset of dementia (either positive or negative) or not, based on the data in the meta-analysis.</w:t>
+      <w:r>
+        <w:t>Additionally, the estimated mean age at dementia onsets for monolinguals and bilinguals was 69.62 years with a 95% Crl [63.16, 77.00] and 73.03 years with a 95% Crl [66.05, 80.53] after including years of education into the model. Using avg_comparisons() again, the mean average difference between the age at dementia onset for bilinguals and monolinguals was 3.65 years with a 95% Crl [2.55, 4.91]. The result was close to the previous model, where education was not included (3.45 years with a 95% Crl [2.8, 4.1]). Therefore, the results from Bayesian linear regression indicated that years of education did not have a strong effect on the effect of bilingualism on age at onset of dementia, although the role of education is uncertain.</w:t>
       </w:r>
     </w:p>
     <w:p>
       <w:pPr>
         <w:pStyle w:val="BodyText"/>
-      </w:pPr>
-    </w:p>
-    <w:p>
-      <w:pPr>
-        <w:pStyle w:val="BodyText"/>
-        <w:jc w:val="both"/>
-      </w:pPr>
-      <w:r>
-        <w:t>Additionally, the estimated mean age at dementia onsets for monolinguals and bilinguals was 69.62 years with a 95% Crl [63.16, 77.00] and 73.03 years with a 95% Crl [66.05, 80.53] after including years of education into the model. Using avg_comparisons() again, the mean average difference between the age at dementia onset for bilinguals and monolinguals was 3.65 years with a 95% Crl [2.55, 4.91]. The result was close to the previous model, where education was not included (3.45 years with a 95% Crl [2.8, 4.1]). Therefore, the results from Bayesian linear regression indicated that years of education did not have a strong effect on the effect of bilingualism on age at onset of dementia, although the role of education is uncertain.</w:t>
-      </w:r>
-    </w:p>
-    <w:p>
-      <w:pPr>
-        <w:pStyle w:val="BodyText"/>
         <w:jc w:val="both"/>
       </w:pPr>
     </w:p>
     <w:p>
       <w:pPr>
         <w:pStyle w:val="Heading3"/>
+        <w:jc w:val="both"/>
       </w:pPr>
       <w:bookmarkStart w:id="24" w:name="subgroup-analysis-of-dementia-type"/>
+      <w:bookmarkEnd w:id="23"/>
       <w:r>
         <w:t>Subgroup Analysis of Dementia Type</w:t>
       </w:r>
@@ -1139,6 +1070,7 @@
     <w:p>
       <w:pPr>
         <w:pStyle w:val="TableCaption"/>
+        <w:jc w:val="both"/>
       </w:pPr>
       <w:r>
         <w:t>Cross-sectional Studies of Three Dementia Subgroups</w:t>
@@ -1150,7 +1082,6 @@
         <w:tblW w:w="5000" w:type="pct"/>
         <w:tblLayout w:type="fixed"/>
         <w:tblLook w:val="0020" w:firstRow="1" w:lastRow="0" w:firstColumn="0" w:lastColumn="0" w:noHBand="0" w:noVBand="0"/>
-        <w:tblCaption w:val="Cross-sectional Studies of Three Dementia Subgroups"/>
       </w:tblPr>
       <w:tblGrid>
         <w:gridCol w:w="2261"/>
@@ -1170,6 +1101,7 @@
           <w:p>
             <w:pPr>
               <w:pStyle w:val="Compact"/>
+              <w:jc w:val="both"/>
             </w:pPr>
             <w:r>
               <w:t>Study</w:t>
@@ -1183,6 +1115,7 @@
           <w:p>
             <w:pPr>
               <w:pStyle w:val="Compact"/>
+              <w:jc w:val="both"/>
             </w:pPr>
             <w:r>
               <w:t>Dementia Diagnosis</w:t>
@@ -1196,6 +1129,7 @@
           <w:p>
             <w:pPr>
               <w:pStyle w:val="Compact"/>
+              <w:jc w:val="both"/>
             </w:pPr>
             <w:r>
               <w:t>Type of Dementia or MCI</w:t>
@@ -1209,6 +1143,7 @@
           <w:p>
             <w:pPr>
               <w:pStyle w:val="Compact"/>
+              <w:jc w:val="both"/>
             </w:pPr>
             <w:r>
               <w:t>Mean Age of Diagnosis &amp; Symptom Onset (SD)</w:t>
@@ -1224,6 +1159,7 @@
           <w:p>
             <w:pPr>
               <w:pStyle w:val="Compact"/>
+              <w:jc w:val="both"/>
             </w:pPr>
             <w:r>
               <w:t>Alladi et al. (2013)</w:t>
@@ -1237,6 +1173,7 @@
           <w:p>
             <w:pPr>
               <w:pStyle w:val="Compact"/>
+              <w:jc w:val="both"/>
             </w:pPr>
             <w:r>
               <w:t>Cambridge Memory Clinic model</w:t>
@@ -1250,6 +1187,7 @@
           <w:p>
             <w:pPr>
               <w:pStyle w:val="Compact"/>
+              <w:jc w:val="both"/>
             </w:pPr>
             <w:r>
               <w:t>AD</w:t>
@@ -1263,6 +1201,7 @@
           <w:p>
             <w:pPr>
               <w:pStyle w:val="Compact"/>
+              <w:jc w:val="both"/>
             </w:pPr>
             <w:r>
               <w:t>ML: 65.4 (10.0); BL: 68.6 (9.6)</w:t>
@@ -1278,6 +1217,7 @@
           <w:p>
             <w:pPr>
               <w:pStyle w:val="Compact"/>
+              <w:jc w:val="both"/>
             </w:pPr>
             <w:r>
               <w:t>Bialystok et al. (2007)</w:t>
@@ -1291,6 +1231,7 @@
           <w:p>
             <w:pPr>
               <w:pStyle w:val="Compact"/>
+              <w:jc w:val="both"/>
             </w:pPr>
             <w:r>
               <w:t>NINCDS-ADRDA</w:t>
@@ -1304,6 +1245,7 @@
           <w:p>
             <w:pPr>
               <w:pStyle w:val="Compact"/>
+              <w:jc w:val="both"/>
             </w:pPr>
             <w:r>
               <w:t>AD</w:t>
@@ -1317,6 +1259,7 @@
           <w:p>
             <w:pPr>
               <w:pStyle w:val="Compact"/>
+              <w:jc w:val="both"/>
             </w:pPr>
             <w:r>
               <w:t>ML: 71.4 (9.6); BL: 75.5 (8.5)</w:t>
@@ -1332,9 +1275,9 @@
           <w:p>
             <w:pPr>
               <w:pStyle w:val="Compact"/>
-            </w:pPr>
-            <w:r>
-              <w:lastRenderedPageBreak/>
+              <w:jc w:val="both"/>
+            </w:pPr>
+            <w:r>
               <w:t>Bialystok et al. (2014)</w:t>
             </w:r>
           </w:p>
@@ -1346,6 +1289,7 @@
           <w:p>
             <w:pPr>
               <w:pStyle w:val="Compact"/>
+              <w:jc w:val="both"/>
             </w:pPr>
             <w:r>
               <w:t>NA</w:t>
@@ -1359,6 +1303,7 @@
           <w:p>
             <w:pPr>
               <w:pStyle w:val="Compact"/>
+              <w:jc w:val="both"/>
             </w:pPr>
             <w:r>
               <w:t>AD</w:t>
@@ -1372,6 +1317,7 @@
           <w:p>
             <w:pPr>
               <w:pStyle w:val="Compact"/>
+              <w:jc w:val="both"/>
             </w:pPr>
             <w:r>
               <w:t>ML: 70.9 (11.0); BL: 78.2 (8.9)</w:t>
@@ -1387,6 +1333,7 @@
           <w:p>
             <w:pPr>
               <w:pStyle w:val="Compact"/>
+              <w:jc w:val="both"/>
             </w:pPr>
             <w:r>
               <w:t>Berkes et al. (2020)</w:t>
@@ -1400,6 +1347,7 @@
           <w:p>
             <w:pPr>
               <w:pStyle w:val="Compact"/>
+              <w:jc w:val="both"/>
             </w:pPr>
             <w:r>
               <w:t>MMSE, MoCA</w:t>
@@ -1413,6 +1361,7 @@
           <w:p>
             <w:pPr>
               <w:pStyle w:val="Compact"/>
+              <w:jc w:val="both"/>
             </w:pPr>
             <w:r>
               <w:t>AD</w:t>
@@ -1426,6 +1375,7 @@
           <w:p>
             <w:pPr>
               <w:pStyle w:val="Compact"/>
+              <w:jc w:val="both"/>
             </w:pPr>
             <w:r>
               <w:t>ML: 78.2 (7.7); BL: 79.8 (8.4)</w:t>
@@ -1441,8 +1391,10 @@
           <w:p>
             <w:pPr>
               <w:pStyle w:val="Compact"/>
-            </w:pPr>
-            <w:r>
+              <w:jc w:val="both"/>
+            </w:pPr>
+            <w:r>
+              <w:lastRenderedPageBreak/>
               <w:t>Chertkow et al. (2010)</w:t>
             </w:r>
           </w:p>
@@ -1454,6 +1406,7 @@
           <w:p>
             <w:pPr>
               <w:pStyle w:val="Compact"/>
+              <w:jc w:val="both"/>
             </w:pPr>
             <w:r>
               <w:t>Patient &amp; caregiver interviews</w:t>
@@ -1467,6 +1420,7 @@
           <w:p>
             <w:pPr>
               <w:pStyle w:val="Compact"/>
+              <w:jc w:val="both"/>
             </w:pPr>
             <w:r>
               <w:t>AD</w:t>
@@ -1480,6 +1434,7 @@
           <w:p>
             <w:pPr>
               <w:pStyle w:val="Compact"/>
+              <w:jc w:val="both"/>
             </w:pPr>
             <w:r>
               <w:t>ML: 76.7 (7.8); BL: 77.6 (7.2)</w:t>
@@ -1495,6 +1450,7 @@
           <w:p>
             <w:pPr>
               <w:pStyle w:val="Compact"/>
+              <w:jc w:val="both"/>
             </w:pPr>
             <w:r>
               <w:t>Clare et al. (2016)</w:t>
@@ -1508,6 +1464,7 @@
           <w:p>
             <w:pPr>
               <w:pStyle w:val="Compact"/>
+              <w:jc w:val="both"/>
             </w:pPr>
             <w:r>
               <w:t>LQ-SV</w:t>
@@ -1521,6 +1478,7 @@
           <w:p>
             <w:pPr>
               <w:pStyle w:val="Compact"/>
+              <w:jc w:val="both"/>
             </w:pPr>
             <w:r>
               <w:t>AD</w:t>
@@ -1534,6 +1492,7 @@
           <w:p>
             <w:pPr>
               <w:pStyle w:val="Compact"/>
+              <w:jc w:val="both"/>
             </w:pPr>
             <w:r>
               <w:t>ML: 76.2 (8.75); BL: 79.3 (6.78)</w:t>
@@ -1549,6 +1508,7 @@
           <w:p>
             <w:pPr>
               <w:pStyle w:val="Compact"/>
+              <w:jc w:val="both"/>
             </w:pPr>
             <w:r>
               <w:t>Craik et al. (2010)</w:t>
@@ -1562,6 +1522,7 @@
           <w:p>
             <w:pPr>
               <w:pStyle w:val="Compact"/>
+              <w:jc w:val="both"/>
             </w:pPr>
             <w:r>
               <w:t>NA</w:t>
@@ -1575,6 +1536,7 @@
           <w:p>
             <w:pPr>
               <w:pStyle w:val="Compact"/>
+              <w:jc w:val="both"/>
             </w:pPr>
             <w:r>
               <w:t>AD</w:t>
@@ -1588,6 +1550,7 @@
           <w:p>
             <w:pPr>
               <w:pStyle w:val="Compact"/>
+              <w:jc w:val="both"/>
             </w:pPr>
             <w:r>
               <w:t>ML: 72.6 (10); BL: 77.7 (7.9)</w:t>
@@ -1603,6 +1566,7 @@
           <w:p>
             <w:pPr>
               <w:pStyle w:val="Compact"/>
+              <w:jc w:val="both"/>
             </w:pPr>
             <w:r>
               <w:t>Leon et al. (2020)</w:t>
@@ -1616,6 +1580,7 @@
           <w:p>
             <w:pPr>
               <w:pStyle w:val="Compact"/>
+              <w:jc w:val="both"/>
             </w:pPr>
             <w:r>
               <w:t>NA</w:t>
@@ -1629,6 +1594,7 @@
           <w:p>
             <w:pPr>
               <w:pStyle w:val="Compact"/>
+              <w:jc w:val="both"/>
             </w:pPr>
             <w:r>
               <w:t>AD</w:t>
@@ -1642,6 +1608,7 @@
           <w:p>
             <w:pPr>
               <w:pStyle w:val="Compact"/>
+              <w:jc w:val="both"/>
             </w:pPr>
             <w:r>
               <w:t>ML: 60.3 (9.8); BL: 61.9 (9.8)</w:t>
@@ -1657,6 +1624,7 @@
           <w:p>
             <w:pPr>
               <w:pStyle w:val="Compact"/>
+              <w:jc w:val="both"/>
             </w:pPr>
             <w:r>
               <w:t>Duncan et al. (2018)</w:t>
@@ -1670,6 +1638,7 @@
           <w:p>
             <w:pPr>
               <w:pStyle w:val="Compact"/>
+              <w:jc w:val="both"/>
             </w:pPr>
             <w:r>
               <w:t>NINCDS-ADRDA</w:t>
@@ -1683,6 +1652,7 @@
           <w:p>
             <w:pPr>
               <w:pStyle w:val="Compact"/>
+              <w:jc w:val="both"/>
             </w:pPr>
             <w:r>
               <w:t>AD</w:t>
@@ -1696,6 +1666,7 @@
           <w:p>
             <w:pPr>
               <w:pStyle w:val="Compact"/>
+              <w:jc w:val="both"/>
             </w:pPr>
             <w:r>
               <w:t>ML: 74.3 (1.5); BL: 72.6 (1.6)</w:t>
@@ -1711,6 +1682,7 @@
           <w:p>
             <w:pPr>
               <w:pStyle w:val="Compact"/>
+              <w:jc w:val="both"/>
             </w:pPr>
             <w:r>
               <w:t>Kowoll et al. (2016)</w:t>
@@ -1724,6 +1696,7 @@
           <w:p>
             <w:pPr>
               <w:pStyle w:val="Compact"/>
+              <w:jc w:val="both"/>
             </w:pPr>
             <w:r>
               <w:t>NINCDS-ADRDA</w:t>
@@ -1737,6 +1710,7 @@
           <w:p>
             <w:pPr>
               <w:pStyle w:val="Compact"/>
+              <w:jc w:val="both"/>
             </w:pPr>
             <w:r>
               <w:t>AD</w:t>
@@ -1750,6 +1724,7 @@
           <w:p>
             <w:pPr>
               <w:pStyle w:val="Compact"/>
+              <w:jc w:val="both"/>
             </w:pPr>
             <w:r>
               <w:t>ML: 71.6 (7.9); BL: 74.6 (6.8)</w:t>
@@ -1765,6 +1740,7 @@
           <w:p>
             <w:pPr>
               <w:pStyle w:val="Compact"/>
+              <w:jc w:val="both"/>
             </w:pPr>
             <w:r>
               <w:t>Perani et al. (2017)</w:t>
@@ -1778,6 +1754,7 @@
           <w:p>
             <w:pPr>
               <w:pStyle w:val="Compact"/>
+              <w:jc w:val="both"/>
             </w:pPr>
             <w:r>
               <w:t>NIA-AA</w:t>
@@ -1791,6 +1768,7 @@
           <w:p>
             <w:pPr>
               <w:pStyle w:val="Compact"/>
+              <w:jc w:val="both"/>
             </w:pPr>
             <w:r>
               <w:t>AD</w:t>
@@ -1804,6 +1782,7 @@
           <w:p>
             <w:pPr>
               <w:pStyle w:val="Compact"/>
+              <w:jc w:val="both"/>
             </w:pPr>
             <w:r>
               <w:t>ML: 71.4 (4.88); BL: 77.1 (4.52)</w:t>
@@ -1819,6 +1798,7 @@
           <w:p>
             <w:pPr>
               <w:pStyle w:val="Compact"/>
+              <w:jc w:val="both"/>
             </w:pPr>
             <w:r>
               <w:t>Mendez et al. (2020)</w:t>
@@ -1832,6 +1812,7 @@
           <w:p>
             <w:pPr>
               <w:pStyle w:val="Compact"/>
+              <w:jc w:val="both"/>
             </w:pPr>
             <w:r>
               <w:t>NIA-AA</w:t>
@@ -1845,6 +1826,7 @@
           <w:p>
             <w:pPr>
               <w:pStyle w:val="Compact"/>
+              <w:jc w:val="both"/>
             </w:pPr>
             <w:r>
               <w:t>AD</w:t>
@@ -1858,6 +1840,7 @@
           <w:p>
             <w:pPr>
               <w:pStyle w:val="Compact"/>
+              <w:jc w:val="both"/>
             </w:pPr>
             <w:r>
               <w:t>ML: 58 (10.7); BL: 62.4 (10.5)</w:t>
@@ -1873,6 +1856,7 @@
           <w:p>
             <w:pPr>
               <w:pStyle w:val="Compact"/>
+              <w:jc w:val="both"/>
             </w:pPr>
             <w:r>
               <w:t>E. V. Y. Woumans et al. (2015)</w:t>
@@ -1886,6 +1870,7 @@
           <w:p>
             <w:pPr>
               <w:pStyle w:val="Compact"/>
+              <w:jc w:val="both"/>
             </w:pPr>
             <w:r>
               <w:t>Neurologist + Neuropsychologist</w:t>
@@ -1899,6 +1884,7 @@
           <w:p>
             <w:pPr>
               <w:pStyle w:val="Compact"/>
+              <w:jc w:val="both"/>
             </w:pPr>
             <w:r>
               <w:t>AD</w:t>
@@ -1912,6 +1898,7 @@
           <w:p>
             <w:pPr>
               <w:pStyle w:val="Compact"/>
+              <w:jc w:val="both"/>
             </w:pPr>
             <w:r>
               <w:t>ML: 73.8 (8.8); BL: 75.5 (8.2)</w:t>
@@ -1927,6 +1914,7 @@
           <w:p>
             <w:pPr>
               <w:pStyle w:val="Compact"/>
+              <w:jc w:val="both"/>
             </w:pPr>
             <w:r>
               <w:t>Zheng et al. (2018)</w:t>
@@ -1940,6 +1928,7 @@
           <w:p>
             <w:pPr>
               <w:pStyle w:val="Compact"/>
+              <w:jc w:val="both"/>
             </w:pPr>
             <w:r>
               <w:t>NINCDS-ADRDA</w:t>
@@ -1953,6 +1942,7 @@
           <w:p>
             <w:pPr>
               <w:pStyle w:val="Compact"/>
+              <w:jc w:val="both"/>
             </w:pPr>
             <w:r>
               <w:t>AD</w:t>
@@ -1966,6 +1956,7 @@
           <w:p>
             <w:pPr>
               <w:pStyle w:val="Compact"/>
+              <w:jc w:val="both"/>
             </w:pPr>
             <w:r>
               <w:t>ML: 63.9 (96.5), 63.4 (8.94); BL: 70.9 (9.37)</w:t>
@@ -1981,6 +1972,7 @@
           <w:p>
             <w:pPr>
               <w:pStyle w:val="Compact"/>
+              <w:jc w:val="both"/>
             </w:pPr>
             <w:r>
               <w:t>Alladi et al. (2013)</w:t>
@@ -1994,6 +1986,7 @@
           <w:p>
             <w:pPr>
               <w:pStyle w:val="Compact"/>
+              <w:jc w:val="both"/>
             </w:pPr>
             <w:r>
               <w:t>Cambridge Memory Clinic model</w:t>
@@ -2007,6 +2000,7 @@
           <w:p>
             <w:pPr>
               <w:pStyle w:val="Compact"/>
+              <w:jc w:val="both"/>
             </w:pPr>
             <w:r>
               <w:t>FTD</w:t>
@@ -2020,6 +2014,7 @@
           <w:p>
             <w:pPr>
               <w:pStyle w:val="Compact"/>
+              <w:jc w:val="both"/>
             </w:pPr>
             <w:r>
               <w:t>ML: 55.6 (10.5); BL: 61.6 (9)</w:t>
@@ -2035,6 +2030,7 @@
           <w:p>
             <w:pPr>
               <w:pStyle w:val="Compact"/>
+              <w:jc w:val="both"/>
             </w:pPr>
             <w:r>
               <w:t>Alladi et al. (2017)</w:t>
@@ -2048,6 +2044,7 @@
           <w:p>
             <w:pPr>
               <w:pStyle w:val="Compact"/>
+              <w:jc w:val="both"/>
             </w:pPr>
             <w:r>
               <w:t>MMSE, ACE-R, CDR, FrSBe</w:t>
@@ -2061,6 +2058,7 @@
           <w:p>
             <w:pPr>
               <w:pStyle w:val="Compact"/>
+              <w:jc w:val="both"/>
             </w:pPr>
             <w:r>
               <w:t>FTD</w:t>
@@ -2074,6 +2072,7 @@
           <w:p>
             <w:pPr>
               <w:pStyle w:val="Compact"/>
+              <w:jc w:val="both"/>
             </w:pPr>
             <w:r>
               <w:t>ML: 58.4 (9.3); BL: 61.7 (9.1)</w:t>
@@ -2089,6 +2088,7 @@
           <w:p>
             <w:pPr>
               <w:pStyle w:val="Compact"/>
+              <w:jc w:val="both"/>
             </w:pPr>
             <w:r>
               <w:t>Leon et al. (2024)</w:t>
@@ -2102,6 +2102,7 @@
           <w:p>
             <w:pPr>
               <w:pStyle w:val="Compact"/>
+              <w:jc w:val="both"/>
             </w:pPr>
             <w:r>
               <w:t>NA</w:t>
@@ -2115,6 +2116,7 @@
           <w:p>
             <w:pPr>
               <w:pStyle w:val="Compact"/>
+              <w:jc w:val="both"/>
             </w:pPr>
             <w:r>
               <w:t>FTD</w:t>
@@ -2128,6 +2130,7 @@
           <w:p>
             <w:pPr>
               <w:pStyle w:val="Compact"/>
+              <w:jc w:val="both"/>
             </w:pPr>
             <w:r>
               <w:t>ML: 59 (9.2); BL: 61.4 (7.9)</w:t>
@@ -2143,6 +2146,7 @@
           <w:p>
             <w:pPr>
               <w:pStyle w:val="Compact"/>
+              <w:jc w:val="both"/>
             </w:pPr>
             <w:r>
               <w:t>Berkes et al. (2020)</w:t>
@@ -2156,6 +2160,7 @@
           <w:p>
             <w:pPr>
               <w:pStyle w:val="Compact"/>
+              <w:jc w:val="both"/>
             </w:pPr>
             <w:r>
               <w:t>MMSE, MoCA</w:t>
@@ -2169,6 +2174,7 @@
           <w:p>
             <w:pPr>
               <w:pStyle w:val="Compact"/>
+              <w:jc w:val="both"/>
             </w:pPr>
             <w:r>
               <w:t>MCI</w:t>
@@ -2182,6 +2188,7 @@
           <w:p>
             <w:pPr>
               <w:pStyle w:val="Compact"/>
+              <w:jc w:val="both"/>
             </w:pPr>
             <w:r>
               <w:t>ML: 75.5 (7.6); BL: 77.8 (8.2)</w:t>
@@ -2197,6 +2204,7 @@
           <w:p>
             <w:pPr>
               <w:pStyle w:val="Compact"/>
+              <w:jc w:val="both"/>
             </w:pPr>
             <w:r>
               <w:t>Ossher et al. (2013)</w:t>
@@ -2210,6 +2218,7 @@
           <w:p>
             <w:pPr>
               <w:pStyle w:val="Compact"/>
+              <w:jc w:val="both"/>
             </w:pPr>
             <w:r>
               <w:t>Neuropsychological interview</w:t>
@@ -2223,6 +2232,7 @@
           <w:p>
             <w:pPr>
               <w:pStyle w:val="Compact"/>
+              <w:jc w:val="both"/>
             </w:pPr>
             <w:r>
               <w:t>Single Domain aMCI</w:t>
@@ -2236,6 +2246,7 @@
           <w:p>
             <w:pPr>
               <w:pStyle w:val="Compact"/>
+              <w:jc w:val="both"/>
             </w:pPr>
             <w:r>
               <w:t>ML: 74.9 (49); BL: 79.4 (6.3)</w:t>
@@ -2251,6 +2262,7 @@
           <w:p>
             <w:pPr>
               <w:pStyle w:val="Compact"/>
+              <w:jc w:val="both"/>
             </w:pPr>
             <w:r>
               <w:t>Ossher et al. (2013)</w:t>
@@ -2264,6 +2276,7 @@
           <w:p>
             <w:pPr>
               <w:pStyle w:val="Compact"/>
+              <w:jc w:val="both"/>
             </w:pPr>
             <w:r>
               <w:t>Neuropsychological interview</w:t>
@@ -2277,6 +2290,7 @@
           <w:p>
             <w:pPr>
               <w:pStyle w:val="Compact"/>
+              <w:jc w:val="both"/>
             </w:pPr>
             <w:r>
               <w:t>Multiple Domain aMCI</w:t>
@@ -2290,6 +2304,7 @@
           <w:p>
             <w:pPr>
               <w:pStyle w:val="Compact"/>
+              <w:jc w:val="both"/>
             </w:pPr>
             <w:r>
               <w:t>ML: 75.2 (8.5); BL: 72.6 (7.2)</w:t>
@@ -2305,13 +2320,10 @@
           <w:p>
             <w:pPr>
               <w:pStyle w:val="Compact"/>
-            </w:pPr>
-            <w:r>
-              <w:t xml:space="preserve">Ramakrishnan et </w:t>
-            </w:r>
-            <w:r>
-              <w:lastRenderedPageBreak/>
-              <w:t>al. (2017)</w:t>
+              <w:jc w:val="both"/>
+            </w:pPr>
+            <w:r>
+              <w:t>Ramakrishnan et al. (2017)</w:t>
             </w:r>
           </w:p>
         </w:tc>
@@ -2322,9 +2334,9 @@
           <w:p>
             <w:pPr>
               <w:pStyle w:val="Compact"/>
-            </w:pPr>
-            <w:r>
-              <w:lastRenderedPageBreak/>
+              <w:jc w:val="both"/>
+            </w:pPr>
+            <w:r>
               <w:t>Petersen’s criteria</w:t>
             </w:r>
           </w:p>
@@ -2336,6 +2348,7 @@
           <w:p>
             <w:pPr>
               <w:pStyle w:val="Compact"/>
+              <w:jc w:val="both"/>
             </w:pPr>
             <w:r>
               <w:t>MCI</w:t>
@@ -2349,13 +2362,10 @@
           <w:p>
             <w:pPr>
               <w:pStyle w:val="Compact"/>
-            </w:pPr>
-            <w:r>
-              <w:t xml:space="preserve">ML: 55.8 (12.2); BL: </w:t>
-            </w:r>
-            <w:r>
-              <w:lastRenderedPageBreak/>
-              <w:t>63.2 (10.1)</w:t>
+              <w:jc w:val="both"/>
+            </w:pPr>
+            <w:r>
+              <w:t>ML: 55.8 (12.2); BL: 63.2 (10.1)</w:t>
             </w:r>
           </w:p>
         </w:tc>
@@ -2370,29 +2380,33 @@
           <w:b/>
           <w:bCs/>
         </w:rPr>
+        <w:t>Abbreviations</w:t>
+      </w:r>
+      <w:r>
+        <w:t>: ML = Monolinguals; BL = Bilinguals; MCI = Mild Cognitive Impairment;</w:t>
+      </w:r>
+      <w:r>
+        <w:br/>
+        <w:t xml:space="preserve">ACE-R = Addenbrooke’s Cognitive Examination-revised; FrSBe = Frontal Systems Behaviour </w:t>
+      </w:r>
+      <w:proofErr w:type="spellStart"/>
+      <w:r>
+        <w:t>Scale;MMSE</w:t>
+      </w:r>
+      <w:proofErr w:type="spellEnd"/>
+      <w:r>
+        <w:t xml:space="preserve"> = Mini-Mental State Examination; MoCA = Montreal Cognitive </w:t>
+      </w:r>
+      <w:r>
         <w:lastRenderedPageBreak/>
-        <w:t>Abbreviations</w:t>
-      </w:r>
-      <w:r>
-        <w:t>: ML = Monolinguals; BL = Bilinguals; MCI = Mild Cognitive Impairment;</w:t>
-      </w:r>
-      <w:r>
-        <w:br/>
-        <w:t>ACE-R = Addenbrooke’s Cognitive Examination-revised; FrSBe = Frontal Systems Behaviour Scale;</w:t>
-      </w:r>
-      <w:r>
-        <w:br/>
-        <w:t>MMSE = Mini-Mental State Examination; MoCA = Montreal Cognitive Assessment;</w:t>
-      </w:r>
-      <w:r>
-        <w:br/>
+        <w:t>Assessment;</w:t>
+      </w:r>
+      <w:r>
+        <w:t xml:space="preserve"> </w:t>
+      </w:r>
+      <w:r>
         <w:t>NINCDS-ADRDA = National Institute on Aging-Alzheimer’s Association consensus criteria</w:t>
       </w:r>
-    </w:p>
-    <w:p>
-      <w:pPr>
-        <w:pStyle w:val="BodyText"/>
-      </w:pPr>
     </w:p>
     <w:p>
       <w:pPr>
@@ -2429,40 +2443,40 @@
                 <w:noProof/>
               </w:rPr>
               <w:drawing>
-                <wp:inline distT="0" distB="0" distL="0" distR="0" wp14:anchorId="7119E80D" wp14:editId="09E8244D">
-                  <wp:extent cx="5334000" cy="4267200"/>
+                <wp:inline distT="0" distB="0" distL="0" distR="0" wp14:anchorId="215B52B8" wp14:editId="5FDBB46C">
+                  <wp:extent cx="5943600" cy="3606165"/>
                   <wp:effectExtent l="0" t="0" r="0" b="0"/>
-                  <wp:docPr id="55" name="Picture"/>
-                  <wp:cNvGraphicFramePr/>
+                  <wp:docPr id="150532946" name="Picture 2"/>
+                  <wp:cNvGraphicFramePr>
+                    <a:graphicFrameLocks xmlns:a="http://schemas.openxmlformats.org/drawingml/2006/main" noChangeAspect="1"/>
+                  </wp:cNvGraphicFramePr>
                   <a:graphic xmlns:a="http://schemas.openxmlformats.org/drawingml/2006/main">
                     <a:graphicData uri="http://schemas.openxmlformats.org/drawingml/2006/picture">
                       <pic:pic xmlns:pic="http://schemas.openxmlformats.org/drawingml/2006/picture">
                         <pic:nvPicPr>
-                          <pic:cNvPr id="56" name="Picture" descr="Bilingualism-and-Dementia_Meta-analysis_files/figure-docx/fig-fig5-1.png"/>
-                          <pic:cNvPicPr>
-                            <a:picLocks noChangeAspect="1" noChangeArrowheads="1"/>
-                          </pic:cNvPicPr>
+                          <pic:cNvPr id="150532946" name="Picture 150532946"/>
+                          <pic:cNvPicPr/>
                         </pic:nvPicPr>
                         <pic:blipFill>
-                          <a:blip r:embed="rId9"/>
+                          <a:blip r:embed="rId9" cstate="print">
+                            <a:extLst>
+                              <a:ext uri="{28A0092B-C50C-407E-A947-70E740481C1C}">
+                                <a14:useLocalDpi xmlns:a14="http://schemas.microsoft.com/office/drawing/2010/main" val="0"/>
+                              </a:ext>
+                            </a:extLst>
+                          </a:blip>
                           <a:stretch>
                             <a:fillRect/>
                           </a:stretch>
                         </pic:blipFill>
-                        <pic:spPr bwMode="auto">
+                        <pic:spPr>
                           <a:xfrm>
                             <a:off x="0" y="0"/>
-                            <a:ext cx="5334000" cy="4267200"/>
+                            <a:ext cx="5943600" cy="3606165"/>
                           </a:xfrm>
                           <a:prstGeom prst="rect">
                             <a:avLst/>
                           </a:prstGeom>
-                          <a:noFill/>
-                          <a:ln w="9525">
-                            <a:noFill/>
-                            <a:headEnd/>
-                            <a:tailEnd/>
-                          </a:ln>
                         </pic:spPr>
                       </pic:pic>
                     </a:graphicData>
@@ -2478,7 +2492,6 @@
               <w:jc w:val="both"/>
             </w:pPr>
             <w:r>
-              <w:lastRenderedPageBreak/>
               <w:t>Figure 5: AD Subgroup: Forest plot of Bilingualism and Age at Onset of Dementia</w:t>
             </w:r>
           </w:p>
@@ -2492,7 +2505,6 @@
         <w:jc w:val="both"/>
       </w:pPr>
       <w:r>
-        <w:lastRenderedPageBreak/>
         <w:t xml:space="preserve">For the AD dementia subgroup (see </w:t>
       </w:r>
       <w:hyperlink w:anchor="fig-fig5">
@@ -2504,7 +2516,11 @@
         </w:r>
       </w:hyperlink>
       <w:r>
-        <w:t xml:space="preserve"> for the forest plot), the results showed that at the population-level, monolinguals had an age at AD onset at 70.39 years with a 95%Crl [66.90, 73.33] while the age at AD onset for bilinguals was 73.68 with a 95%Crl [70.59, 76.69]. The mean average difference between the age at AD onset for bilinguals and monolinguals was 3.36 with a 95%Crl [2.61, 4.15]. Compared with the main meta-analytic results, the estimated age at AD onset was higher for both monolingual and bilingual populations. Yet, the difference between bilinguals’ and monolinguals’ age at onset (3.36-year) was smaller although very close to the main effect (3.45-year). Moreover, the level of heterogeneity decreased moderately compared with the mean meta-analytic results since the group-level estimated effects for mobimonolingual and mobibilingual were 6.09 and 5.57.</w:t>
+        <w:t xml:space="preserve"> for the forest plot), the results showed that at the population-level, monolinguals had an age at AD onset at 70.39 years with a 95%Crl [66.90, 73.33] while the age at AD onset for bilinguals was 73.68 with a 95%Crl [70.59, 76.69]. The mean average difference between the age at AD onset for bilinguals and monolinguals was 3.36 with a 95%Crl [2.61, 4.15]. Compared with the main meta-analytic results, the estimated age at AD onset was higher for both monolingual and bilingual populations. Yet, the difference between bilinguals’ and monolinguals’ age at onset (3.36-year) was smaller although very close to the main effect (3.45-year). Moreover, the level of heterogeneity decreased moderately compared with the mean meta-analytic results since </w:t>
+      </w:r>
+      <w:r>
+        <w:lastRenderedPageBreak/>
+        <w:t>the group-level estimated effects for mobimonolingual and mobibilingual were 6.09 and 5.57.</w:t>
       </w:r>
     </w:p>
     <w:tbl>
@@ -2533,40 +2549,40 @@
                 <w:noProof/>
               </w:rPr>
               <w:drawing>
-                <wp:inline distT="0" distB="0" distL="0" distR="0" wp14:anchorId="29C54EE7" wp14:editId="1170BED9">
-                  <wp:extent cx="5334000" cy="4267200"/>
+                <wp:inline distT="0" distB="0" distL="0" distR="0" wp14:anchorId="7FFADCD9" wp14:editId="30A9096F">
+                  <wp:extent cx="5943600" cy="3606165"/>
                   <wp:effectExtent l="0" t="0" r="0" b="0"/>
-                  <wp:docPr id="59" name="Picture"/>
-                  <wp:cNvGraphicFramePr/>
+                  <wp:docPr id="1029039916" name="Picture 3" descr="A graph with blue dots and numbers&#10;&#10;AI-generated content may be incorrect."/>
+                  <wp:cNvGraphicFramePr>
+                    <a:graphicFrameLocks xmlns:a="http://schemas.openxmlformats.org/drawingml/2006/main" noChangeAspect="1"/>
+                  </wp:cNvGraphicFramePr>
                   <a:graphic xmlns:a="http://schemas.openxmlformats.org/drawingml/2006/main">
                     <a:graphicData uri="http://schemas.openxmlformats.org/drawingml/2006/picture">
                       <pic:pic xmlns:pic="http://schemas.openxmlformats.org/drawingml/2006/picture">
                         <pic:nvPicPr>
-                          <pic:cNvPr id="60" name="Picture" descr="Bilingualism-and-Dementia_Meta-analysis_files/figure-docx/fig-fig6-1.png"/>
-                          <pic:cNvPicPr>
-                            <a:picLocks noChangeAspect="1" noChangeArrowheads="1"/>
-                          </pic:cNvPicPr>
+                          <pic:cNvPr id="1029039916" name="Picture 3" descr="A graph with blue dots and numbers&#10;&#10;AI-generated content may be incorrect."/>
+                          <pic:cNvPicPr/>
                         </pic:nvPicPr>
                         <pic:blipFill>
-                          <a:blip r:embed="rId10"/>
+                          <a:blip r:embed="rId10" cstate="print">
+                            <a:extLst>
+                              <a:ext uri="{28A0092B-C50C-407E-A947-70E740481C1C}">
+                                <a14:useLocalDpi xmlns:a14="http://schemas.microsoft.com/office/drawing/2010/main" val="0"/>
+                              </a:ext>
+                            </a:extLst>
+                          </a:blip>
                           <a:stretch>
                             <a:fillRect/>
                           </a:stretch>
                         </pic:blipFill>
-                        <pic:spPr bwMode="auto">
+                        <pic:spPr>
                           <a:xfrm>
                             <a:off x="0" y="0"/>
-                            <a:ext cx="5334000" cy="4267200"/>
+                            <a:ext cx="5943600" cy="3606165"/>
                           </a:xfrm>
                           <a:prstGeom prst="rect">
                             <a:avLst/>
                           </a:prstGeom>
-                          <a:noFill/>
-                          <a:ln w="9525">
-                            <a:noFill/>
-                            <a:headEnd/>
-                            <a:tailEnd/>
-                          </a:ln>
                         </pic:spPr>
                       </pic:pic>
                     </a:graphicData>
@@ -2606,11 +2622,7 @@
         </w:r>
       </w:hyperlink>
       <w:r>
-        <w:t xml:space="preserve"> for the forest plot), the estimated age at FTD onsets for monolinguals and bilinguals were 58.02 with a 95%Crl [52.95, 62.84] and 61.44 with a 95%Crl [57.01, 64.35], which were largely lower than the main meta-analytic effect and AD subgroup’s onset. Using avg_comparisons() again, the average difference in </w:t>
-      </w:r>
-      <w:r>
-        <w:lastRenderedPageBreak/>
-        <w:t>marginal effects for bilinguals and monolinguals was 3.76 with a 95%Crl [1.46, 6.26]. This showed that bilinguals were 3.76 years older than monolinguals when having the first symptom onset for FTD type of dementia. The heterogeneity level was even lower in this group as since the group-level estimated effects for mobimonolingual and mobibilingual were 2.92 and 1.61. Yet, the relatively low number of studies might have contributed to the low heterogeneity and the wide 95%Crl of the estimated difference between bilinguals and monolinguals at the population level.</w:t>
+        <w:t xml:space="preserve"> for the forest plot), the estimated age at FTD onsets for monolinguals and bilinguals were 58.02 with a 95%Crl [52.95, 62.84] and 61.44 with a 95%Crl [57.01, 64.35], which were largely lower than the main meta-analytic effect and AD subgroup’s onset. Using avg_comparisons() again, the average difference in marginal effects for bilinguals and monolinguals was 3.76 with a 95%Crl [1.46, 6.26]. This showed that bilinguals were 3.76 years older than monolinguals when having the first symptom onset for FTD type of dementia. The heterogeneity level was even lower in this group as since the group-level estimated effects for mobimonolingual and mobibilingual were 2.92 and 1.61. Yet, the relatively low number of studies might have contributed to the low heterogeneity and the wide 95%Crl of the estimated difference between bilinguals and monolinguals at the population level.</w:t>
       </w:r>
     </w:p>
     <w:tbl>
@@ -2638,41 +2650,42 @@
               <w:rPr>
                 <w:noProof/>
               </w:rPr>
+              <w:lastRenderedPageBreak/>
               <w:drawing>
-                <wp:inline distT="0" distB="0" distL="0" distR="0" wp14:anchorId="2D5656E3" wp14:editId="645003F3">
-                  <wp:extent cx="5334000" cy="4267200"/>
+                <wp:inline distT="0" distB="0" distL="0" distR="0" wp14:anchorId="2F55CEE1" wp14:editId="3F295B86">
+                  <wp:extent cx="5943600" cy="3606165"/>
                   <wp:effectExtent l="0" t="0" r="0" b="0"/>
-                  <wp:docPr id="63" name="Picture"/>
-                  <wp:cNvGraphicFramePr/>
+                  <wp:docPr id="2023080858" name="Picture 4"/>
+                  <wp:cNvGraphicFramePr>
+                    <a:graphicFrameLocks xmlns:a="http://schemas.openxmlformats.org/drawingml/2006/main" noChangeAspect="1"/>
+                  </wp:cNvGraphicFramePr>
                   <a:graphic xmlns:a="http://schemas.openxmlformats.org/drawingml/2006/main">
                     <a:graphicData uri="http://schemas.openxmlformats.org/drawingml/2006/picture">
                       <pic:pic xmlns:pic="http://schemas.openxmlformats.org/drawingml/2006/picture">
                         <pic:nvPicPr>
-                          <pic:cNvPr id="64" name="Picture" descr="Bilingualism-and-Dementia_Meta-analysis_files/figure-docx/fig-fig7-1.png"/>
-                          <pic:cNvPicPr>
-                            <a:picLocks noChangeAspect="1" noChangeArrowheads="1"/>
-                          </pic:cNvPicPr>
+                          <pic:cNvPr id="2023080858" name="Picture 2023080858"/>
+                          <pic:cNvPicPr/>
                         </pic:nvPicPr>
                         <pic:blipFill>
-                          <a:blip r:embed="rId11"/>
+                          <a:blip r:embed="rId11" cstate="print">
+                            <a:extLst>
+                              <a:ext uri="{28A0092B-C50C-407E-A947-70E740481C1C}">
+                                <a14:useLocalDpi xmlns:a14="http://schemas.microsoft.com/office/drawing/2010/main" val="0"/>
+                              </a:ext>
+                            </a:extLst>
+                          </a:blip>
                           <a:stretch>
                             <a:fillRect/>
                           </a:stretch>
                         </pic:blipFill>
-                        <pic:spPr bwMode="auto">
+                        <pic:spPr>
                           <a:xfrm>
                             <a:off x="0" y="0"/>
-                            <a:ext cx="5334000" cy="4267200"/>
+                            <a:ext cx="5943600" cy="3606165"/>
                           </a:xfrm>
                           <a:prstGeom prst="rect">
                             <a:avLst/>
                           </a:prstGeom>
-                          <a:noFill/>
-                          <a:ln w="9525">
-                            <a:noFill/>
-                            <a:headEnd/>
-                            <a:tailEnd/>
-                          </a:ln>
                         </pic:spPr>
                       </pic:pic>
                     </a:graphicData>
@@ -2712,37 +2725,34 @@
         </w:r>
       </w:hyperlink>
       <w:r>
-        <w:t xml:space="preserve"> for the forest plot), the estimated age at MCI onsets was 68.52 (95%Crl [54.91, 80.60]) for monolinguals and 72.06 (95%Crl [59.80, 83.31]) for bilinguals, which was slightly earlier than AD subgroup. Such results were expected since mild cognitive development is the transitional stage between healthy brain condition and dementia (Frank &amp; Petersen, 2008). However, the estimated average difference in marginal effects for bilinguals and monolinguals was 2.88 years with a 95%Crl [0.914, 4.84]. This difference between the age at onset of bilinguals and monolinguals was the smallest in the three subgroups. Additionally, the standard deviation for mobimonolingual (11.50) and mobibilingual (9.19) (group-level effects) were the largest among the three groups. This indicated that there were large variations between the age at onset across different studies </w:t>
-      </w:r>
+        <w:t xml:space="preserve"> for the forest plot), the estimated age at MCI onsets was 68.52 (95%Crl [54.91, 80.60]) for monolinguals and 72.06 (95%Crl [59.80, 83.31]) for bilinguals, which was slightly earlier than AD subgroup. Such results were expected since mild cognitive development is the transitional stage between healthy brain condition and dementia (Frank &amp; Petersen, 2008). However, the estimated average difference in marginal effects for bilinguals and monolinguals was 2.88 years with a 95%Crl [0.914, 4.84]. This difference between the age at onset of bilinguals and monolinguals was the smallest in the three subgroups. Additionally, the standard deviation for mobimonolingual (11.50) and mobibilingual (9.19) (group-level effects) were the largest among the three groups. This indicated that there were large variations between the age at onset across different studies in the MCI subgroups. It could be because one study’s (Ramakrishnan et al., 2017) age at MCI onset was extremely lower than the other two (Berkes et al., 2020; Ossher et al., 2013).</w:t>
+      </w:r>
+    </w:p>
+    <w:p>
+      <w:pPr>
+        <w:pStyle w:val="BodyText"/>
+        <w:jc w:val="both"/>
+      </w:pPr>
+      <w:r>
+        <w:t>Comparing the three subgroups at the population-level, it could be found that the AD subgroup had the latest age at onset for both bilinguals and monolinguals while the FTD subgroup had the earliest. For the difference between the age at onset of bilinguals and monolinguals, the FTD subgroup had the largest difference following the AD subgroup. The MCI subgroup’s difference was quite smaller than the two. Additionally, the difference in heterogeneity among the groups may account for the relatively large heterogeneity in the main meta-analysis. These results will be further discussed in the discussion section.</w:t>
+      </w:r>
+    </w:p>
+    <w:p>
+      <w:pPr>
+        <w:pStyle w:val="BodyText"/>
+        <w:jc w:val="both"/>
+      </w:pPr>
+    </w:p>
+    <w:p>
+      <w:pPr>
+        <w:pStyle w:val="Heading2"/>
+        <w:jc w:val="both"/>
+      </w:pPr>
+      <w:bookmarkStart w:id="28" w:name="addressing-bias"/>
+      <w:bookmarkEnd w:id="19"/>
+      <w:bookmarkEnd w:id="24"/>
       <w:r>
         <w:lastRenderedPageBreak/>
-        <w:t>in the MCI subgroups. It could be because one study’s (Ramakrishnan et al., 2017) age at MCI onset was extremely lower than the other two (Berkes et al., 2020; Ossher et al., 2013).</w:t>
-      </w:r>
-    </w:p>
-    <w:p>
-      <w:pPr>
-        <w:pStyle w:val="BodyText"/>
-        <w:jc w:val="both"/>
-      </w:pPr>
-    </w:p>
-    <w:p>
-      <w:pPr>
-        <w:pStyle w:val="BodyText"/>
-        <w:jc w:val="both"/>
-      </w:pPr>
-      <w:r>
-        <w:t>Comparing the three subgroups at the population-level, it could be found that the AD subgroup had the latest age at onset for both bilinguals and monolinguals while the FTD subgroup had the earliest. For the difference between the age at onset of bilinguals and monolinguals, the FTD subgroup had the largest difference following the AD subgroup. The MCI subgroup’s difference was quite smaller than the two. Additionally, the difference in heterogeneity among the groups may account for the relatively large heterogeneity in the main meta-analysis. These results will be further discussed in the discussion section.</w:t>
-      </w:r>
-    </w:p>
-    <w:p>
-      <w:pPr>
-        <w:pStyle w:val="Heading2"/>
-        <w:jc w:val="both"/>
-      </w:pPr>
-      <w:bookmarkStart w:id="28" w:name="addressing-bias"/>
-      <w:bookmarkEnd w:id="23"/>
-      <w:bookmarkEnd w:id="24"/>
-      <w:r>
         <w:t>Addressing Bias</w:t>
       </w:r>
     </w:p>
@@ -2772,7 +2782,7 @@
                 <w:noProof/>
               </w:rPr>
               <w:drawing>
-                <wp:inline distT="0" distB="0" distL="0" distR="0" wp14:anchorId="6CB47809" wp14:editId="626DEDA6">
+                <wp:inline distT="0" distB="0" distL="0" distR="0" wp14:anchorId="0ED343C5" wp14:editId="59DB86AD">
                   <wp:extent cx="5334000" cy="3429000"/>
                   <wp:effectExtent l="0" t="0" r="0" b="0"/>
                   <wp:docPr id="69" name="Picture"/>
@@ -2856,11 +2866,7 @@
         </w:r>
       </w:hyperlink>
       <w:r>
-        <w:t xml:space="preserve">), the dots are not symmetrically distributed around the summary effect although the number of studies in the left side of the summary effect is the same as the right side. Moreover, two studies on the left (Chertkow et al., 2010; Duncan et al., 2018) </w:t>
-      </w:r>
-      <w:r>
-        <w:lastRenderedPageBreak/>
-        <w:t>and one study on the right (Perani et al., 2017) were not covered in the funnel shape. This means that there is potential bias caused by the selected studies. Therefore, it was necessary to check whether the meta-analytic effect was greatly influenced by potential bias.</w:t>
+        <w:t>), the dots are not symmetrically distributed around the summary effect although the number of studies in the left side of the summary effect is the same as the right side. Moreover, two studies on the left (Chertkow et al., 2010; Duncan et al., 2018) and one study on the right (Perani et al., 2017) were not covered in the funnel shape. This means that there is potential bias caused by the selected studies. Therefore, it was necessary to check whether the meta-analytic effect was greatly influenced by potential bias.</w:t>
       </w:r>
     </w:p>
     <w:p>
@@ -2868,15 +2874,15 @@
         <w:pStyle w:val="BodyText"/>
         <w:jc w:val="both"/>
       </w:pPr>
+      <w:r>
+        <w:t>The researcher removed the studies that fell outside the funnel shape to rerun the Bayesian linear model. At the population level, the results showed that the estimated age at dementia onset for monolinguals is 66.46 with a 95%Crl [62.75, 70.17] and for bilinguals is 70.37 with a 95%Crl [67.03, 73.81]. The estimated average difference in the onset of dementia between bilinguals and monolinguals is 3.88 years with a 95%Crl [3.11, 4.65], which is even higher than the mean meta-analytic effect, 3.45 years. This provides evidence that the meta-analytic effect was not a total result of bias.</w:t>
+      </w:r>
     </w:p>
     <w:p>
       <w:pPr>
         <w:pStyle w:val="BodyText"/>
         <w:jc w:val="both"/>
       </w:pPr>
-      <w:r>
-        <w:t>The researcher removed the studies that fell outside the funnel shape to rerun the Bayesian linear model. At the population level, the results showed that the estimated age at dementia onset for monolinguals is 66.46 with a 95%Crl [62.75, 70.17] and for bilinguals is 70.37 with a 95%Crl [67.03, 73.81]. The estimated average difference in the onset of dementia between bilinguals and monolinguals is 3.88 years with a 95%Crl [3.11, 4.65], which is even higher than the mean meta-analytic effect, 3.45 years. This provides evidence that the meta-analytic effect was not a total result of bias.</w:t>
-      </w:r>
     </w:p>
     <w:p>
       <w:pPr>
@@ -2902,7 +2908,7 @@
       <w:tr>
         <w:tc>
           <w:tcPr>
-            <w:tcW w:w="7920" w:type="dxa"/>
+            <w:tcW w:w="9576" w:type="dxa"/>
           </w:tcPr>
           <w:p>
             <w:pPr>
@@ -2915,40 +2921,40 @@
                 <w:noProof/>
               </w:rPr>
               <w:drawing>
-                <wp:inline distT="0" distB="0" distL="0" distR="0" wp14:anchorId="2E42E73A" wp14:editId="57AD6174">
-                  <wp:extent cx="5334000" cy="4267200"/>
+                <wp:inline distT="0" distB="0" distL="0" distR="0" wp14:anchorId="0DABCDEA" wp14:editId="32F369AA">
+                  <wp:extent cx="5943600" cy="3606165"/>
                   <wp:effectExtent l="0" t="0" r="0" b="0"/>
-                  <wp:docPr id="74" name="Picture"/>
-                  <wp:cNvGraphicFramePr/>
+                  <wp:docPr id="1134338154" name="Picture 5" descr="A graph with numbers and lines&#10;&#10;AI-generated content may be incorrect."/>
+                  <wp:cNvGraphicFramePr>
+                    <a:graphicFrameLocks xmlns:a="http://schemas.openxmlformats.org/drawingml/2006/main" noChangeAspect="1"/>
+                  </wp:cNvGraphicFramePr>
                   <a:graphic xmlns:a="http://schemas.openxmlformats.org/drawingml/2006/main">
                     <a:graphicData uri="http://schemas.openxmlformats.org/drawingml/2006/picture">
                       <pic:pic xmlns:pic="http://schemas.openxmlformats.org/drawingml/2006/picture">
                         <pic:nvPicPr>
-                          <pic:cNvPr id="75" name="Picture" descr="Bilingualism-and-Dementia_Meta-analysis_files/figure-docx/fig-fig9-1.png"/>
-                          <pic:cNvPicPr>
-                            <a:picLocks noChangeAspect="1" noChangeArrowheads="1"/>
-                          </pic:cNvPicPr>
+                          <pic:cNvPr id="1134338154" name="Picture 5" descr="A graph with numbers and lines&#10;&#10;AI-generated content may be incorrect."/>
+                          <pic:cNvPicPr/>
                         </pic:nvPicPr>
                         <pic:blipFill>
-                          <a:blip r:embed="rId13"/>
+                          <a:blip r:embed="rId13" cstate="print">
+                            <a:extLst>
+                              <a:ext uri="{28A0092B-C50C-407E-A947-70E740481C1C}">
+                                <a14:useLocalDpi xmlns:a14="http://schemas.microsoft.com/office/drawing/2010/main" val="0"/>
+                              </a:ext>
+                            </a:extLst>
+                          </a:blip>
                           <a:stretch>
                             <a:fillRect/>
                           </a:stretch>
                         </pic:blipFill>
-                        <pic:spPr bwMode="auto">
+                        <pic:spPr>
                           <a:xfrm>
                             <a:off x="0" y="0"/>
-                            <a:ext cx="5334000" cy="4267200"/>
+                            <a:ext cx="5943600" cy="3606165"/>
                           </a:xfrm>
                           <a:prstGeom prst="rect">
                             <a:avLst/>
                           </a:prstGeom>
-                          <a:noFill/>
-                          <a:ln w="9525">
-                            <a:noFill/>
-                            <a:headEnd/>
-                            <a:tailEnd/>
-                          </a:ln>
                         </pic:spPr>
                       </pic:pic>
                     </a:graphicData>
@@ -2977,23 +2983,13 @@
         <w:jc w:val="both"/>
       </w:pPr>
       <w:r>
-        <w:lastRenderedPageBreak/>
-        <w:t>The results showed that the population-level estimate for monolingual is -2.06 with a 95%Crl [-3.05, -1.16] and that the estimate for bilingual is -2.27 with a 95%Crl [-3.09, -1.47]. We also used avg_comparison() to show the ratio of the average predicted probability of dementia for bilinguals to the average predicted probability of dementia for monolinguals, which resulted in a 0.845 estimate with a 95%Crl [0.726, 0.984]. This indicated that the average predicted probability of dementia for bilingual individuals was from 72.6% to 98.4% of the average predicted probability of dementia for monolinguals. In other words, the meta-analytic effect was likely to fall between 1.6% and 27.4% lower incidence for bilinguals compared with monolinguals based on the included 6 studies. This is a small to moderate effect for bilingualism (see Figure 9 for forest plot). It is possible that such a result was influenced by bias given the relatively small number of studies. Yet, the funnel plot is believed not to be reliable if the number of studies is under 10 (Sedgwick &amp; Marston, 2015). Therefore, the present thesis did not use funnel plot to address the potential bias.</w:t>
-      </w:r>
-    </w:p>
-    <w:p>
-      <w:pPr>
-        <w:pStyle w:val="BodyText"/>
-        <w:jc w:val="both"/>
-      </w:pPr>
-    </w:p>
-    <w:p>
-      <w:pPr>
-        <w:pStyle w:val="BodyText"/>
-        <w:jc w:val="both"/>
-      </w:pPr>
-      <w:r>
-        <w:t>Nevertheless, a detailed inspection of the context of these studies and the forest plot (</w:t>
+        <w:t>To investigate whether bilingualism is associated with reduced dementia risks, we fitted a Bayesian hierarchical logistic regression model predicting the number of dementia cases out of total number of participants using a binomial likelihood.</w:t>
+      </w:r>
+      <w:r>
+        <w:t xml:space="preserve"> The results </w:t>
+      </w:r>
+      <w:r>
+        <w:t xml:space="preserve">showed that the population-level estimate for monolingual is -2.06 with a 95%Crl [-3.05, -1.16] and that the estimate for bilingual is -2.27 with a 95%Crl [-3.09, -1.47]. We also used avg_comparison() to show the ratio of the average predicted probability of dementia for bilinguals to the average predicted probability of dementia for monolinguals, which resulted in a 0.845 estimate with a 95%Crl [0.726, 0.984]. This indicated that the average predicted probability of dementia for bilingual individuals was from 72.6% to 98.4% of the average predicted probability of dementia for monolinguals. In other words, the meta-analytic effect was likely to fall between 1.6% and 27.4% lower incidence for bilinguals compared with monolinguals based on the included 6 studies. This is a small to moderate effect for bilingualism (see </w:t>
       </w:r>
       <w:hyperlink w:anchor="fig-fig9">
         <w:r>
@@ -3004,8 +3000,38 @@
         </w:r>
       </w:hyperlink>
       <w:r>
+        <w:t xml:space="preserve"> </w:t>
+      </w:r>
+      <w:r>
+        <w:t>for forest plot). It is possible that such a result was influenced by bias given the relatively small number of studies. Yet, the funnel plot is believed not to be reliable if the number of studies is under 10 (Sedgwick &amp; Marston, 2015). Therefore, the present thesis did not use funnel plot to address the potential bias.</w:t>
+      </w:r>
+    </w:p>
+    <w:p>
+      <w:pPr>
+        <w:pStyle w:val="BodyText"/>
+        <w:jc w:val="both"/>
+      </w:pPr>
+      <w:r>
+        <w:lastRenderedPageBreak/>
+        <w:t>Nevertheless, a detailed inspection of the context of these studies and the forest plot (</w:t>
+      </w:r>
+      <w:hyperlink w:anchor="fig-fig9">
+        <w:r>
+          <w:rPr>
+            <w:rStyle w:val="Hyperlink"/>
+          </w:rPr>
+          <w:t>Figure 9</w:t>
+        </w:r>
+      </w:hyperlink>
+      <w:r>
         <w:t>) revealed that one study had great influence on the results (Venugopal et al., 2024). The estimated difference in dementia risk of bilinguals and monolinguals is between -1.27 and -0.43 log-odds at 95% probability, which corresponds to 21.9% and 39.4% lower probability for bilinguals (Venugopal et al., 2024). The study design of this community-based study is a corss-sectional study, which is different from the other five longitudinal studies. Considering such difference, we reran the Bayesian model without Venugopal et al. (2024). The results showed that the average incidence rates for bilinguals is about 86.6% of the incidence rate of monolinguals with a 95% Crl [0.634, 1.5]. This means that we are relatively uncertain about whether bilinguals have a lower incidence rate than monolinguals at the population-level, since the 95% credible interval cross 1.</w:t>
       </w:r>
+    </w:p>
+    <w:p>
+      <w:pPr>
+        <w:pStyle w:val="BodyText"/>
+        <w:jc w:val="both"/>
+      </w:pPr>
     </w:p>
     <w:p>
       <w:pPr>
@@ -3049,11 +3075,7 @@
         <w:jc w:val="both"/>
       </w:pPr>
       <w:r>
-        <w:t xml:space="preserve">In terms of the first research question (i.e., Are there differences between the age at onset of dementia for bilinguals and monolinguals? If so, is the effect influenced greatly by bias?), the findings reveal that bilinguals are 3.45 years older than monolinguals on </w:t>
-      </w:r>
-      <w:r>
-        <w:lastRenderedPageBreak/>
-        <w:t>average when they first have symptoms of dementia. This is in line with the results of two previous meta-analyses which found a moderate protective effect of bilingualism on age at dementia onset ranging from effect size Cohen’s d = 0.32 (Anderson et al., 2020) to a delay of 4.7 years for AD symptoms onset (Brini et al., 2020). A further inspection of potential bias using funnel plot reveals the existence of bias since three studies lie outside the funnel shape. Yet, the difference between bilingual and monolingual populations’ age at dementia onset was even larger (3.65 years on average) after removing the three studies in the model. Therefore, the present meta-analysis provides evidence for a potential bilingualism effect on delaying the onset of dementia, which supports the bilingualism and cognitive reserve link that was discussed in section 2.2.</w:t>
+        <w:t>In terms of the first research question (i.e., Are there differences between the age at onset of dementia for bilinguals and monolinguals? If so, is the effect influenced greatly by bias?), the findings reveal that bilinguals are 3.45 years older than monolinguals on average when they first have symptoms of dementia. This is in line with the results of two previous meta-analyses which found a moderate protective effect of bilingualism on age at dementia onset ranging from effect size Cohen’s d = 0.32 (Anderson et al., 2020) to a delay of 4.7 years for AD symptoms onset (Brini et al., 2020). A further inspection of potential bias using funnel plot reveals the existence of bias since three studies lie outside the funnel shape. Yet, the difference between bilingual and monolingual populations’ age at dementia onset was even larger (3.65 years on average) after removing the three studies in the model. Therefore, the present meta-analysis provides evidence for a potential bilingualism effect on delaying the onset of dementia, which supports the bilingualism and cognitive reserve link that was discussed in section 2.2.</w:t>
       </w:r>
     </w:p>
     <w:p>
@@ -3069,6 +3091,7 @@
       <w:bookmarkStart w:id="34" w:name="X23dc1278349a1e4fe68c8080647585d6eb1a909"/>
       <w:bookmarkEnd w:id="33"/>
       <w:r>
+        <w:lastRenderedPageBreak/>
         <w:t>The Bilingualism’s Preventive Effect is not Robust</w:t>
       </w:r>
     </w:p>
@@ -3080,11 +3103,6 @@
       <w:r>
         <w:t>For the second research question (i.e., Is there a bilingualism’s preventing effect on dementia?), the present thesis did not produce robust evidence although the meta-analytic effect favours bilingualism. The meta-analytic effect is that the incidence rate of dementia for bilinguals is 1.6% to 27.4% lower than monolinguals at 95% probability with an average estimate of 15.5% lower incidence. This result is largely in line with (Anderson et al., 2020), which found week evidence for bilingualism preventing dementia (Cohen’s d = 0.10).</w:t>
       </w:r>
-    </w:p>
-    <w:p>
-      <w:pPr>
-        <w:pStyle w:val="BodyText"/>
-      </w:pPr>
     </w:p>
     <w:p>
       <w:pPr>
@@ -3109,7 +3127,6 @@
       <w:bookmarkStart w:id="35" w:name="confounding-and-modulating-variables"/>
       <w:bookmarkEnd w:id="34"/>
       <w:r>
-        <w:lastRenderedPageBreak/>
         <w:t>Confounding and Modulating Variables</w:t>
       </w:r>
     </w:p>
@@ -3145,6 +3162,7 @@
       <w:bookmarkStart w:id="37" w:name="X5131b7e25cfc0c0e1ccb7f2e96bfc94d7a97092"/>
       <w:bookmarkEnd w:id="36"/>
       <w:r>
+        <w:lastRenderedPageBreak/>
         <w:t>Bilingualism may Defer Different Types of Dementia Differently</w:t>
       </w:r>
     </w:p>
@@ -3163,11 +3181,7 @@
         <w:jc w:val="both"/>
       </w:pPr>
       <w:r>
-        <w:t xml:space="preserve">Future empirical studies investigating the bilingualism and dementia link are suggested to view bilingualism and dementia as highly dynamic phenomena rather than unitary ones. More efforts should be paid to investigate the neuropathology of different subtypes of dementia and how different bilingualism experiences affect the onset of symptoms of these subtypes. It should also be noted that bilingualism is not the only factor that contributes to cognitive reserve and the delay of dementia. On the one hand, future </w:t>
-      </w:r>
-      <w:r>
-        <w:lastRenderedPageBreak/>
-        <w:t>researchers should follow Alladi et al. (2013) and Craik et al. (2010) examples to control potential confounding variables. On the other, they can compare the effect of bilingualism with other mentally challenging activities such as engaging in difficult physical activities (Sofi et al., 2011), playing an instrument (Hanna-</w:t>
+        <w:t>Future empirical studies investigating the bilingualism and dementia link are suggested to view bilingualism and dementia as highly dynamic phenomena rather than unitary ones. More efforts should be paid to investigate the neuropathology of different subtypes of dementia and how different bilingualism experiences affect the onset of symptoms of these subtypes. It should also be noted that bilingualism is not the only factor that contributes to cognitive reserve and the delay of dementia. On the one hand, future researchers should follow Alladi et al. (2013) and Craik et al. (2010) examples to control potential confounding variables. On the other, they can compare the effect of bilingualism with other mentally challenging activities such as engaging in difficult physical activities (Sofi et al., 2011), playing an instrument (Hanna-</w:t>
       </w:r>
       <w:proofErr w:type="spellStart"/>
       <w:r>
@@ -3203,22 +3217,27 @@
         <w:jc w:val="both"/>
       </w:pPr>
       <w:r>
-        <w:t>One potential limitation of the present thesis is that it does not view bilingualism as a continuum. This is partially because most previous empirical studies employed a dichotomous categorization of bilinguals and monolinguals. For the studies that did use bilingualism as a continuum, measurements also varies since some used the frequency of code-switching (Calabria et al., 2020) while others used objective measures (e.g., Boston Naming Test in Gollan et al., 2012). Given the limited number of such studies and various measurements, the present meta-analysis did not include them. Future meta-analyses can attempt to include these studies as more new studies using similar measurements appear.</w:t>
+        <w:t xml:space="preserve">One potential limitation of the present thesis is that it does not view bilingualism as a continuum. This is partially because most previous empirical studies employed a dichotomous categorization of bilinguals and monolinguals. For the studies that did use bilingualism as a continuum, measurements also varies since some used the frequency of code-switching (Calabria et al., 2020) while others used objective measures (e.g., Boston Naming Test in Gollan et al., 2012). Given the limited number of such studies and various measurements, the present meta-analysis did not include them. Future meta-analyses </w:t>
+      </w:r>
+      <w:r>
+        <w:lastRenderedPageBreak/>
+        <w:t>can attempt to include these studies as more new studies using similar measurements appear.</w:t>
       </w:r>
     </w:p>
     <w:p>
       <w:pPr>
         <w:pStyle w:val="BodyText"/>
-      </w:pPr>
+        <w:jc w:val="both"/>
+      </w:pPr>
+      <w:r>
+        <w:t>Borenstein et al. (2021) state that it is rare for researchers to collect all the studies that meet the inclusion criteria into the meta-analysis. The researcher is aware that some studies that meet the inclusion criterion might be missing and that access to unpublished articles was limited. The relatively small number of studies (18 studies for age at onset and 6 studies for incidence rate) might be the reason for notable uncertainty in the results of the Bayesian linear regression model.</w:t>
+      </w:r>
     </w:p>
     <w:p>
       <w:pPr>
         <w:pStyle w:val="BodyText"/>
         <w:jc w:val="both"/>
       </w:pPr>
-      <w:r>
-        <w:t>Borenstein et al. (2021) state that it is rare for researchers to collect all the studies that meet the inclusion criteria into the meta-analysis. The researcher is aware that some studies that meet the inclusion criterion might be missing and that access to unpublished articles was limited. The relatively small number of studies (18 studies for age at onset and 6 studies for incidence rate) might be the reason for notable uncertainty in the results of the Bayesian linear regression model.</w:t>
-      </w:r>
     </w:p>
     <w:p>
       <w:pPr>
@@ -3252,7 +3271,6 @@
           <w:b/>
           <w:bCs/>
         </w:rPr>
-        <w:lastRenderedPageBreak/>
         <w:t>Data availability statement</w:t>
       </w:r>
     </w:p>
@@ -3279,15 +3297,10 @@
     <w:p>
       <w:pPr>
         <w:pStyle w:val="Heading1"/>
+        <w:jc w:val="both"/>
       </w:pPr>
       <w:bookmarkStart w:id="41" w:name="references"/>
       <w:bookmarkEnd w:id="40"/>
-    </w:p>
-    <w:p>
-      <w:pPr>
-        <w:pStyle w:val="Heading1"/>
-        <w:jc w:val="both"/>
-      </w:pPr>
       <w:r>
         <w:t>References</w:t>
       </w:r>
@@ -3295,6 +3308,7 @@
     <w:p>
       <w:pPr>
         <w:pStyle w:val="Bibliography"/>
+        <w:ind w:left="454" w:hanging="454"/>
         <w:jc w:val="both"/>
       </w:pPr>
       <w:bookmarkStart w:id="42" w:name="ref-abutalebi2015"/>
@@ -3326,6 +3340,7 @@
     <w:p>
       <w:pPr>
         <w:pStyle w:val="Bibliography"/>
+        <w:ind w:left="454" w:hanging="454"/>
         <w:jc w:val="both"/>
       </w:pPr>
       <w:bookmarkStart w:id="44" w:name="ref-alladi2013"/>
@@ -3357,11 +3372,13 @@
     <w:p>
       <w:pPr>
         <w:pStyle w:val="Bibliography"/>
+        <w:ind w:left="454" w:hanging="454"/>
         <w:jc w:val="both"/>
       </w:pPr>
       <w:bookmarkStart w:id="45" w:name="ref-alladi2017"/>
       <w:bookmarkEnd w:id="44"/>
       <w:r>
+        <w:lastRenderedPageBreak/>
         <w:t xml:space="preserve">Alladi, S., Bak, T. H., Shailaja, M., Gollahalli, D., Rajan, A., Surampudi, B., Hornberger, M., Duggirala, V., Chaudhuri, J. R., &amp; Kaul, S. (2017). Bilingualism delays the onset of behavioral but not aphasic forms of frontotemporal dementia. </w:t>
       </w:r>
       <w:r>
@@ -3388,6 +3405,7 @@
     <w:p>
       <w:pPr>
         <w:pStyle w:val="Bibliography"/>
+        <w:ind w:left="454" w:hanging="454"/>
         <w:jc w:val="both"/>
       </w:pPr>
       <w:bookmarkStart w:id="46" w:name="ref-anderson2020"/>
@@ -3419,6 +3437,7 @@
     <w:p>
       <w:pPr>
         <w:pStyle w:val="Bibliography"/>
+        <w:ind w:left="454" w:hanging="454"/>
         <w:jc w:val="both"/>
       </w:pPr>
       <w:bookmarkStart w:id="47" w:name="ref-arel2024"/>
@@ -3450,6 +3469,7 @@
     <w:p>
       <w:pPr>
         <w:pStyle w:val="Bibliography"/>
+        <w:ind w:left="454" w:hanging="454"/>
         <w:jc w:val="both"/>
       </w:pPr>
       <w:bookmarkStart w:id="48" w:name="ref-bak2016"/>
@@ -3481,6 +3501,7 @@
     <w:p>
       <w:pPr>
         <w:pStyle w:val="Bibliography"/>
+        <w:ind w:left="454" w:hanging="454"/>
         <w:jc w:val="both"/>
       </w:pPr>
       <w:bookmarkStart w:id="49" w:name="ref-bennett2006"/>
@@ -3512,6 +3533,7 @@
     <w:p>
       <w:pPr>
         <w:pStyle w:val="Bibliography"/>
+        <w:ind w:left="454" w:hanging="454"/>
         <w:jc w:val="both"/>
       </w:pPr>
       <w:bookmarkStart w:id="50" w:name="ref-berkes2022"/>
@@ -3543,6 +3565,7 @@
     <w:p>
       <w:pPr>
         <w:pStyle w:val="Bibliography"/>
+        <w:ind w:left="454" w:hanging="454"/>
         <w:jc w:val="both"/>
       </w:pPr>
       <w:bookmarkStart w:id="51" w:name="ref-berkes2020"/>
@@ -3574,12 +3597,12 @@
     <w:p>
       <w:pPr>
         <w:pStyle w:val="Bibliography"/>
+        <w:ind w:left="454" w:hanging="454"/>
         <w:jc w:val="both"/>
       </w:pPr>
       <w:bookmarkStart w:id="52" w:name="ref-bialystok2022"/>
       <w:bookmarkEnd w:id="51"/>
       <w:r>
-        <w:lastRenderedPageBreak/>
         <w:t xml:space="preserve">Bialystok, E., &amp; Craik, F. I. (2022). How does bilingualism modify cognitive function? Attention to the mechanism. </w:t>
       </w:r>
       <w:r>
@@ -3606,6 +3629,7 @@
     <w:p>
       <w:pPr>
         <w:pStyle w:val="Bibliography"/>
+        <w:ind w:left="454" w:hanging="454"/>
         <w:jc w:val="both"/>
       </w:pPr>
       <w:bookmarkStart w:id="53" w:name="ref-bialystok2007"/>
@@ -3637,6 +3661,7 @@
     <w:p>
       <w:pPr>
         <w:pStyle w:val="Bibliography"/>
+        <w:ind w:left="454" w:hanging="454"/>
         <w:jc w:val="both"/>
       </w:pPr>
       <w:bookmarkStart w:id="54" w:name="ref-bialystok2014"/>
@@ -3668,6 +3693,7 @@
     <w:p>
       <w:pPr>
         <w:pStyle w:val="Bibliography"/>
+        <w:ind w:left="454" w:hanging="454"/>
         <w:jc w:val="both"/>
       </w:pPr>
       <w:bookmarkStart w:id="55" w:name="ref-bialystok2012"/>
@@ -3699,6 +3725,7 @@
     <w:p>
       <w:pPr>
         <w:pStyle w:val="Bibliography"/>
+        <w:ind w:left="454" w:hanging="454"/>
         <w:jc w:val="both"/>
       </w:pPr>
       <w:bookmarkStart w:id="56" w:name="ref-blom2014"/>
@@ -3730,6 +3757,7 @@
     <w:p>
       <w:pPr>
         <w:pStyle w:val="Bibliography"/>
+        <w:ind w:left="454" w:hanging="454"/>
         <w:jc w:val="both"/>
       </w:pPr>
       <w:bookmarkStart w:id="57" w:name="ref-borenstein2021"/>
@@ -3751,11 +3779,13 @@
     <w:p>
       <w:pPr>
         <w:pStyle w:val="Bibliography"/>
+        <w:ind w:left="454" w:hanging="454"/>
         <w:jc w:val="both"/>
       </w:pPr>
       <w:bookmarkStart w:id="58" w:name="ref-brier2012"/>
       <w:bookmarkEnd w:id="57"/>
       <w:r>
+        <w:lastRenderedPageBreak/>
         <w:t xml:space="preserve">Brier, M. R., Thomas, J. B., Snyder, A. Z., Benzinger, T. L., Zhang, D., Raichle, M. E., Holtzman, D. M., Morris, J. C., &amp; Ances, B. M. (2012). Loss of intranetwork and internetwork resting state functional connections with alzheimer’s disease progression. </w:t>
       </w:r>
       <w:r>
@@ -3782,6 +3812,7 @@
     <w:p>
       <w:pPr>
         <w:pStyle w:val="Bibliography"/>
+        <w:ind w:left="454" w:hanging="454"/>
         <w:jc w:val="both"/>
       </w:pPr>
       <w:bookmarkStart w:id="59" w:name="ref-brini2020"/>
@@ -3813,6 +3844,7 @@
     <w:p>
       <w:pPr>
         <w:pStyle w:val="Bibliography"/>
+        <w:ind w:left="454" w:hanging="454"/>
         <w:jc w:val="both"/>
       </w:pPr>
       <w:bookmarkStart w:id="60" w:name="ref-burkner2021"/>
@@ -3844,6 +3876,7 @@
     <w:p>
       <w:pPr>
         <w:pStyle w:val="Bibliography"/>
+        <w:ind w:left="454" w:hanging="454"/>
         <w:jc w:val="both"/>
       </w:pPr>
       <w:bookmarkStart w:id="61" w:name="ref-calabria2020"/>
@@ -3875,6 +3908,7 @@
     <w:p>
       <w:pPr>
         <w:pStyle w:val="Bibliography"/>
+        <w:ind w:left="454" w:hanging="454"/>
         <w:jc w:val="both"/>
       </w:pPr>
       <w:bookmarkStart w:id="62" w:name="ref-chan2001"/>
@@ -3906,6 +3940,7 @@
     <w:p>
       <w:pPr>
         <w:pStyle w:val="Bibliography"/>
+        <w:ind w:left="454" w:hanging="454"/>
         <w:jc w:val="both"/>
       </w:pPr>
       <w:bookmarkStart w:id="63" w:name="ref-chertkow2010"/>
@@ -3937,16 +3972,13 @@
     <w:p>
       <w:pPr>
         <w:pStyle w:val="Bibliography"/>
+        <w:ind w:left="454" w:hanging="454"/>
         <w:jc w:val="both"/>
       </w:pPr>
       <w:bookmarkStart w:id="64" w:name="ref-clare2016"/>
       <w:bookmarkEnd w:id="63"/>
       <w:r>
-        <w:t xml:space="preserve">Clare, L., Whitaker, C. J., Craik, F. I., Bialystok, E., Martyr, A., Martin-Forbes, P. A., Bastable, A. J., Pye, K. L., Quinn, C., Thomas, E. M., et al. (2016). Bilingualism, executive </w:t>
-      </w:r>
-      <w:r>
-        <w:lastRenderedPageBreak/>
-        <w:t xml:space="preserve">control, and age at diagnosis among people with early-stage a lzheimer’s disease in w ales. </w:t>
+        <w:t xml:space="preserve">Clare, L., Whitaker, C. J., Craik, F. I., Bialystok, E., Martyr, A., Martin-Forbes, P. A., Bastable, A. J., Pye, K. L., Quinn, C., Thomas, E. M., et al. (2016). Bilingualism, executive control, and age at diagnosis among people with early-stage a lzheimer’s disease in w ales. </w:t>
       </w:r>
       <w:r>
         <w:rPr>
@@ -3972,6 +4004,7 @@
     <w:p>
       <w:pPr>
         <w:pStyle w:val="Bibliography"/>
+        <w:ind w:left="454" w:hanging="454"/>
         <w:jc w:val="both"/>
       </w:pPr>
       <w:bookmarkStart w:id="65" w:name="ref-comishen2021"/>
@@ -3993,6 +4026,7 @@
     <w:p>
       <w:pPr>
         <w:pStyle w:val="Bibliography"/>
+        <w:ind w:left="454" w:hanging="454"/>
         <w:jc w:val="both"/>
       </w:pPr>
       <w:bookmarkStart w:id="66" w:name="ref-craik2010"/>
@@ -4024,6 +4058,7 @@
     <w:p>
       <w:pPr>
         <w:pStyle w:val="Bibliography"/>
+        <w:ind w:left="454" w:hanging="454"/>
         <w:jc w:val="both"/>
       </w:pPr>
       <w:bookmarkStart w:id="67" w:name="ref-davis2008"/>
@@ -4055,6 +4090,7 @@
     <w:p>
       <w:pPr>
         <w:pStyle w:val="Bibliography"/>
+        <w:ind w:left="454" w:hanging="454"/>
         <w:jc w:val="both"/>
       </w:pPr>
       <w:bookmarkStart w:id="68" w:name="ref-duncan2018"/>
@@ -4086,11 +4122,13 @@
     <w:p>
       <w:pPr>
         <w:pStyle w:val="Bibliography"/>
+        <w:ind w:left="454" w:hanging="454"/>
         <w:jc w:val="both"/>
       </w:pPr>
       <w:bookmarkStart w:id="69" w:name="ref-folstein1975"/>
       <w:bookmarkEnd w:id="68"/>
       <w:r>
+        <w:lastRenderedPageBreak/>
         <w:t xml:space="preserve">Folstein, M. F., Folstein, S. E., &amp; McHugh, P. R. (1975). “Mini-mental state”: A practical method for grading the cognitive state of patients for the clinician. </w:t>
       </w:r>
       <w:r>
@@ -4117,6 +4155,7 @@
     <w:p>
       <w:pPr>
         <w:pStyle w:val="Bibliography"/>
+        <w:ind w:left="454" w:hanging="454"/>
         <w:jc w:val="both"/>
       </w:pPr>
       <w:bookmarkStart w:id="70" w:name="ref-frank2008"/>
@@ -4138,6 +4177,7 @@
     <w:p>
       <w:pPr>
         <w:pStyle w:val="Bibliography"/>
+        <w:ind w:left="454" w:hanging="454"/>
         <w:jc w:val="both"/>
       </w:pPr>
       <w:bookmarkStart w:id="71" w:name="ref-frazier2004"/>
@@ -4169,6 +4209,7 @@
     <w:p>
       <w:pPr>
         <w:pStyle w:val="Bibliography"/>
+        <w:ind w:left="454" w:hanging="454"/>
         <w:jc w:val="both"/>
       </w:pPr>
       <w:bookmarkStart w:id="72" w:name="ref-fuller2014"/>
@@ -4187,6 +4228,7 @@
     <w:p>
       <w:pPr>
         <w:pStyle w:val="Bibliography"/>
+        <w:ind w:left="454" w:hanging="454"/>
         <w:jc w:val="both"/>
       </w:pPr>
       <w:bookmarkStart w:id="73" w:name="ref-gatz2001"/>
@@ -4218,6 +4260,7 @@
     <w:p>
       <w:pPr>
         <w:pStyle w:val="Bibliography"/>
+        <w:ind w:left="454" w:hanging="454"/>
         <w:jc w:val="both"/>
       </w:pPr>
       <w:bookmarkStart w:id="74" w:name="ref-gollan2012"/>
@@ -4249,6 +4292,7 @@
     <w:p>
       <w:pPr>
         <w:pStyle w:val="Bibliography"/>
+        <w:ind w:left="454" w:hanging="454"/>
         <w:jc w:val="both"/>
       </w:pPr>
       <w:bookmarkStart w:id="75" w:name="ref-grady1994"/>
@@ -4280,12 +4324,12 @@
     <w:p>
       <w:pPr>
         <w:pStyle w:val="Bibliography"/>
+        <w:ind w:left="454" w:hanging="454"/>
         <w:jc w:val="both"/>
       </w:pPr>
       <w:bookmarkStart w:id="76" w:name="ref-grundy2017"/>
       <w:bookmarkEnd w:id="75"/>
       <w:r>
-        <w:lastRenderedPageBreak/>
         <w:t xml:space="preserve">Grundy, J. G., &amp; Anderson, J. A. (2017). Commentary: The relationship of bilingualism compared to monolingualism to the risk of cognitive decline or dementia: A systematic review and meta-analysis. </w:t>
       </w:r>
       <w:r>
@@ -4312,6 +4356,7 @@
     <w:p>
       <w:pPr>
         <w:pStyle w:val="Bibliography"/>
+        <w:ind w:left="454" w:hanging="454"/>
         <w:jc w:val="both"/>
       </w:pPr>
       <w:bookmarkStart w:id="77" w:name="ref-hanna2011"/>
@@ -4343,6 +4388,7 @@
     <w:p>
       <w:pPr>
         <w:pStyle w:val="Bibliography"/>
+        <w:ind w:left="454" w:hanging="454"/>
         <w:jc w:val="both"/>
       </w:pPr>
       <w:bookmarkStart w:id="78" w:name="ref-hase2018"/>
@@ -4374,6 +4420,7 @@
     <w:p>
       <w:pPr>
         <w:pStyle w:val="Bibliography"/>
+        <w:ind w:left="454" w:hanging="454"/>
         <w:jc w:val="both"/>
       </w:pPr>
       <w:bookmarkStart w:id="79" w:name="ref-homer1994"/>
@@ -4405,6 +4452,7 @@
     <w:p>
       <w:pPr>
         <w:pStyle w:val="Bibliography"/>
+        <w:ind w:left="454" w:hanging="454"/>
         <w:jc w:val="both"/>
       </w:pPr>
       <w:bookmarkStart w:id="80" w:name="ref-jafari2021"/>
@@ -4436,11 +4484,13 @@
     <w:p>
       <w:pPr>
         <w:pStyle w:val="Bibliography"/>
+        <w:ind w:left="454" w:hanging="454"/>
         <w:jc w:val="both"/>
       </w:pPr>
       <w:bookmarkStart w:id="81" w:name="ref-kay2023"/>
       <w:bookmarkEnd w:id="80"/>
       <w:r>
+        <w:lastRenderedPageBreak/>
         <w:t xml:space="preserve">Kay, M., &amp; Mastny, T. (2023). Tidybayes: Tidy data and geoms for bayesian models (v3. 0.4). </w:t>
       </w:r>
       <w:r>
@@ -4457,6 +4507,7 @@
     <w:p>
       <w:pPr>
         <w:pStyle w:val="Bibliography"/>
+        <w:ind w:left="454" w:hanging="454"/>
         <w:jc w:val="both"/>
       </w:pPr>
       <w:bookmarkStart w:id="82" w:name="ref-kepp2016"/>
@@ -4488,6 +4539,7 @@
     <w:p>
       <w:pPr>
         <w:pStyle w:val="Bibliography"/>
+        <w:ind w:left="454" w:hanging="454"/>
         <w:jc w:val="both"/>
       </w:pPr>
       <w:bookmarkStart w:id="83" w:name="ref-kowoll2016"/>
@@ -4527,6 +4579,7 @@
     <w:p>
       <w:pPr>
         <w:pStyle w:val="Bibliography"/>
+        <w:ind w:left="454" w:hanging="454"/>
         <w:jc w:val="both"/>
       </w:pPr>
       <w:bookmarkStart w:id="84" w:name="ref-lawton2015"/>
@@ -4566,6 +4619,7 @@
     <w:p>
       <w:pPr>
         <w:pStyle w:val="Bibliography"/>
+        <w:ind w:left="454" w:hanging="454"/>
         <w:jc w:val="both"/>
       </w:pPr>
       <w:bookmarkStart w:id="85" w:name="ref-lee2022"/>
@@ -4605,6 +4659,7 @@
     <w:p>
       <w:pPr>
         <w:pStyle w:val="Bibliography"/>
+        <w:ind w:left="454" w:hanging="454"/>
         <w:jc w:val="both"/>
       </w:pPr>
       <w:bookmarkStart w:id="86" w:name="ref-de2024"/>
@@ -4636,6 +4691,7 @@
     <w:p>
       <w:pPr>
         <w:pStyle w:val="Bibliography"/>
+        <w:ind w:left="454" w:hanging="454"/>
         <w:jc w:val="both"/>
       </w:pPr>
       <w:bookmarkStart w:id="87" w:name="ref-de2020"/>
@@ -4667,6 +4723,7 @@
     <w:p>
       <w:pPr>
         <w:pStyle w:val="Bibliography"/>
+        <w:ind w:left="454" w:hanging="454"/>
         <w:jc w:val="both"/>
       </w:pPr>
       <w:bookmarkStart w:id="88" w:name="ref-light1984"/>
@@ -4688,12 +4745,12 @@
     <w:p>
       <w:pPr>
         <w:pStyle w:val="Bibliography"/>
+        <w:ind w:left="454" w:hanging="454"/>
         <w:jc w:val="both"/>
       </w:pPr>
       <w:bookmarkStart w:id="89" w:name="ref-ljungberg2016"/>
       <w:bookmarkEnd w:id="88"/>
       <w:r>
-        <w:lastRenderedPageBreak/>
         <w:t xml:space="preserve">Ljungberg, J. K., Hansson, P., Adolfsson, R., &amp; Nilsson, L.-G. (2016). The effect of language skills on dementia in a swedish longitudinal cohort. </w:t>
       </w:r>
       <w:r>
@@ -4720,6 +4777,7 @@
     <w:p>
       <w:pPr>
         <w:pStyle w:val="Bibliography"/>
+        <w:ind w:left="454" w:hanging="454"/>
         <w:jc w:val="both"/>
       </w:pPr>
       <w:bookmarkStart w:id="90" w:name="ref-massoud2010"/>
@@ -4751,6 +4809,7 @@
     <w:p>
       <w:pPr>
         <w:pStyle w:val="Bibliography"/>
+        <w:ind w:left="454" w:hanging="454"/>
         <w:jc w:val="both"/>
       </w:pPr>
       <w:bookmarkStart w:id="91" w:name="ref-meda2013"/>
@@ -4790,6 +4849,7 @@
     <w:p>
       <w:pPr>
         <w:pStyle w:val="Bibliography"/>
+        <w:ind w:left="454" w:hanging="454"/>
         <w:jc w:val="both"/>
       </w:pPr>
       <w:bookmarkStart w:id="92" w:name="ref-mendez2020"/>
@@ -4821,11 +4881,13 @@
     <w:p>
       <w:pPr>
         <w:pStyle w:val="Bibliography"/>
+        <w:ind w:left="454" w:hanging="454"/>
         <w:jc w:val="both"/>
       </w:pPr>
       <w:bookmarkStart w:id="93" w:name="ref-de2018"/>
       <w:bookmarkEnd w:id="92"/>
       <w:r>
+        <w:lastRenderedPageBreak/>
         <w:t xml:space="preserve">Mooij, S. M. de, Henson, R. N., Waldorp, L. J., &amp; Kievit, R. A. (2018). Age differentiation within gray matter, white matter, and between memory and white matter in an adult life span cohort. </w:t>
       </w:r>
       <w:r>
@@ -4852,6 +4914,7 @@
     <w:p>
       <w:pPr>
         <w:pStyle w:val="Bibliography"/>
+        <w:ind w:left="454" w:hanging="454"/>
         <w:jc w:val="both"/>
       </w:pPr>
       <w:bookmarkStart w:id="94" w:name="ref-mukadam2017"/>
@@ -4883,6 +4946,7 @@
     <w:p>
       <w:pPr>
         <w:pStyle w:val="Bibliography"/>
+        <w:ind w:left="454" w:hanging="454"/>
         <w:jc w:val="both"/>
       </w:pPr>
       <w:bookmarkStart w:id="95" w:name="ref-nicenboim2024"/>
@@ -4904,6 +4968,7 @@
     <w:p>
       <w:pPr>
         <w:pStyle w:val="Bibliography"/>
+        <w:ind w:left="454" w:hanging="454"/>
         <w:jc w:val="both"/>
       </w:pPr>
       <w:bookmarkStart w:id="96" w:name="ref-ossher2013"/>
@@ -4935,6 +5000,7 @@
     <w:p>
       <w:pPr>
         <w:pStyle w:val="Bibliography"/>
+        <w:ind w:left="454" w:hanging="454"/>
         <w:jc w:val="both"/>
       </w:pPr>
       <w:bookmarkStart w:id="97" w:name="ref-paap2019"/>
@@ -4956,6 +5022,7 @@
     <w:p>
       <w:pPr>
         <w:pStyle w:val="Bibliography"/>
+        <w:ind w:left="454" w:hanging="454"/>
         <w:jc w:val="both"/>
       </w:pPr>
       <w:bookmarkStart w:id="98" w:name="ref-perani2017"/>
@@ -4987,6 +5054,7 @@
     <w:p>
       <w:pPr>
         <w:pStyle w:val="Bibliography"/>
+        <w:ind w:left="454" w:hanging="454"/>
         <w:jc w:val="both"/>
       </w:pPr>
       <w:bookmarkStart w:id="99" w:name="ref-ramakrishnan2017"/>
@@ -5018,6 +5086,7 @@
     <w:p>
       <w:pPr>
         <w:pStyle w:val="Bibliography"/>
+        <w:ind w:left="454" w:hanging="454"/>
         <w:jc w:val="both"/>
       </w:pPr>
       <w:bookmarkStart w:id="100" w:name="ref-scarmeas2003"/>
@@ -5049,6 +5118,7 @@
     <w:p>
       <w:pPr>
         <w:pStyle w:val="Bibliography"/>
+        <w:ind w:left="454" w:hanging="454"/>
         <w:jc w:val="both"/>
       </w:pPr>
       <w:bookmarkStart w:id="101" w:name="ref-schmid2020"/>
@@ -5070,12 +5140,12 @@
     <w:p>
       <w:pPr>
         <w:pStyle w:val="Bibliography"/>
+        <w:ind w:left="454" w:hanging="454"/>
         <w:jc w:val="both"/>
       </w:pPr>
       <w:bookmarkStart w:id="102" w:name="ref-sedgwick2015"/>
       <w:bookmarkEnd w:id="101"/>
       <w:r>
-        <w:lastRenderedPageBreak/>
         <w:t xml:space="preserve">Sedgwick, P., &amp; Marston, L. (2015). How to read a funnel plot in a meta-analysis. </w:t>
       </w:r>
       <w:r>
@@ -5102,6 +5172,7 @@
     <w:p>
       <w:pPr>
         <w:pStyle w:val="Bibliography"/>
+        <w:ind w:left="454" w:hanging="454"/>
         <w:jc w:val="both"/>
       </w:pPr>
       <w:bookmarkStart w:id="103" w:name="ref-sharp2011"/>
@@ -5133,6 +5204,7 @@
     <w:p>
       <w:pPr>
         <w:pStyle w:val="Bibliography"/>
+        <w:ind w:left="454" w:hanging="454"/>
         <w:jc w:val="both"/>
       </w:pPr>
       <w:bookmarkStart w:id="104" w:name="ref-sofi2011"/>
@@ -5164,6 +5236,7 @@
     <w:p>
       <w:pPr>
         <w:pStyle w:val="Bibliography"/>
+        <w:ind w:left="454" w:hanging="454"/>
         <w:jc w:val="both"/>
       </w:pPr>
       <w:bookmarkStart w:id="105" w:name="ref-stern2002"/>
@@ -5195,6 +5268,7 @@
     <w:p>
       <w:pPr>
         <w:pStyle w:val="Bibliography"/>
+        <w:ind w:left="454" w:hanging="454"/>
         <w:jc w:val="both"/>
       </w:pPr>
       <w:bookmarkStart w:id="106" w:name="ref-stern2012"/>
@@ -5226,11 +5300,13 @@
     <w:p>
       <w:pPr>
         <w:pStyle w:val="Bibliography"/>
+        <w:ind w:left="454" w:hanging="454"/>
         <w:jc w:val="both"/>
       </w:pPr>
       <w:bookmarkStart w:id="107" w:name="ref-stern1999"/>
       <w:bookmarkEnd w:id="106"/>
       <w:r>
+        <w:lastRenderedPageBreak/>
         <w:t xml:space="preserve">Stern, Y., Albert, S., Tang, M. X., &amp; Tsai, W. Y. (1999). Rate of memory decline in AD is related to education and occupation: Cognitive reserve? </w:t>
       </w:r>
       <w:r>
@@ -5257,6 +5333,7 @@
     <w:p>
       <w:pPr>
         <w:pStyle w:val="Bibliography"/>
+        <w:ind w:left="454" w:hanging="454"/>
         <w:jc w:val="both"/>
       </w:pPr>
       <w:bookmarkStart w:id="108" w:name="ref-stern2020"/>
@@ -5288,6 +5365,7 @@
     <w:p>
       <w:pPr>
         <w:pStyle w:val="Bibliography"/>
+        <w:ind w:left="454" w:hanging="454"/>
         <w:jc w:val="both"/>
       </w:pPr>
       <w:bookmarkStart w:id="109" w:name="ref-thierry2007"/>
@@ -5319,6 +5397,7 @@
     <w:p>
       <w:pPr>
         <w:pStyle w:val="Bibliography"/>
+        <w:ind w:left="454" w:hanging="454"/>
         <w:jc w:val="both"/>
       </w:pPr>
       <w:bookmarkStart w:id="110" w:name="ref-turner2009"/>
@@ -5350,6 +5429,7 @@
     <w:p>
       <w:pPr>
         <w:pStyle w:val="Bibliography"/>
+        <w:ind w:left="454" w:hanging="454"/>
         <w:jc w:val="both"/>
       </w:pPr>
       <w:bookmarkStart w:id="111" w:name="ref-venugopal2024"/>
@@ -5381,6 +5461,7 @@
     <w:p>
       <w:pPr>
         <w:pStyle w:val="Bibliography"/>
+        <w:ind w:left="454" w:hanging="454"/>
         <w:jc w:val="both"/>
       </w:pPr>
       <w:bookmarkStart w:id="112" w:name="ref-waldie2009"/>
@@ -5412,6 +5493,7 @@
     <w:p>
       <w:pPr>
         <w:pStyle w:val="Bibliography"/>
+        <w:ind w:left="454" w:hanging="454"/>
         <w:jc w:val="both"/>
       </w:pPr>
       <w:bookmarkStart w:id="113" w:name="ref-who2020"/>
@@ -5444,6 +5526,7 @@
     <w:p>
       <w:pPr>
         <w:pStyle w:val="Bibliography"/>
+        <w:ind w:left="454" w:hanging="454"/>
         <w:jc w:val="both"/>
       </w:pPr>
       <w:bookmarkStart w:id="114" w:name="ref-woumans2015"/>
@@ -5475,12 +5558,12 @@
     <w:p>
       <w:pPr>
         <w:pStyle w:val="Bibliography"/>
+        <w:ind w:left="454" w:hanging="454"/>
         <w:jc w:val="both"/>
       </w:pPr>
       <w:bookmarkStart w:id="115" w:name="ref-woumans2017"/>
       <w:bookmarkEnd w:id="114"/>
       <w:r>
-        <w:lastRenderedPageBreak/>
         <w:t xml:space="preserve">Woumans, E., Versijpt, J., Sieben, A., Santens, P., &amp; Duyck, W. (2017). Bilingualism and cognitive decline: A story of pride and prejudice. </w:t>
       </w:r>
       <w:r>
@@ -5507,6 +5590,7 @@
     <w:p>
       <w:pPr>
         <w:pStyle w:val="Bibliography"/>
+        <w:ind w:left="454" w:hanging="454"/>
         <w:jc w:val="both"/>
       </w:pPr>
       <w:bookmarkStart w:id="116" w:name="ref-zahodne2014"/>
@@ -5538,6 +5622,7 @@
     <w:p>
       <w:pPr>
         <w:pStyle w:val="Bibliography"/>
+        <w:ind w:left="454" w:hanging="454"/>
         <w:jc w:val="both"/>
       </w:pPr>
       <w:bookmarkStart w:id="117" w:name="ref-zheng2018"/>
@@ -5583,7 +5668,7 @@
   <w:abstractNum w:abstractNumId="0" w15:restartNumberingAfterBreak="0">
     <w:nsid w:val="0000A990"/>
     <w:multiLevelType w:val="multilevel"/>
-    <w:tmpl w:val="43BAAD58"/>
+    <w:tmpl w:val="CA1C4C62"/>
     <w:lvl w:ilvl="0">
       <w:numFmt w:val="bullet"/>
       <w:lvlText w:val=" "/>
@@ -5657,7 +5742,7 @@
       </w:pPr>
     </w:lvl>
   </w:abstractNum>
-  <w:num w:numId="1" w16cid:durableId="1794593361">
+  <w:num w:numId="1" w16cid:durableId="158037193">
     <w:abstractNumId w:val="0"/>
   </w:num>
 </w:numbering>

</xml_diff>